<commit_message>
Assignment 7 and 8
</commit_message>
<xml_diff>
--- a/Assignment_7_8.docx
+++ b/Assignment_7_8.docx
@@ -8,6 +8,12 @@
           <w:rFonts w:ascii="Times New Roman" w:hAnsi="Times New Roman" w:cs="Times New Roman"/>
         </w:rPr>
       </w:pPr>
+      <w:r>
+        <w:rPr>
+          <w:rFonts w:ascii="Times New Roman" w:hAnsi="Times New Roman" w:cs="Times New Roman"/>
+        </w:rPr>
+        <w:t>Module 7 and 8</w:t>
+      </w:r>
     </w:p>
     <w:p>
       <w:pPr>
@@ -60,7 +66,21 @@
         <w:rPr>
           <w:rFonts w:ascii="Times New Roman" w:hAnsi="Times New Roman" w:cs="Times New Roman"/>
         </w:rPr>
-        <w:t xml:space="preserve">The nslookup command is used to resolve domain names into IP addresses using DNS. </w:t>
+        <w:t xml:space="preserve">The </w:t>
+      </w:r>
+      <w:proofErr w:type="spellStart"/>
+      <w:r>
+        <w:rPr>
+          <w:rFonts w:ascii="Times New Roman" w:hAnsi="Times New Roman" w:cs="Times New Roman"/>
+        </w:rPr>
+        <w:t>nslookup</w:t>
+      </w:r>
+      <w:proofErr w:type="spellEnd"/>
+      <w:r>
+        <w:rPr>
+          <w:rFonts w:ascii="Times New Roman" w:hAnsi="Times New Roman" w:cs="Times New Roman"/>
+        </w:rPr>
+        <w:t xml:space="preserve"> command is used to resolve domain names into IP addresses using DNS. </w:t>
       </w:r>
     </w:p>
     <w:p>
@@ -83,6 +103,9 @@
     </w:p>
     <w:p>
       <w:r>
+        <w:rPr>
+          <w:noProof/>
+        </w:rPr>
         <w:drawing>
           <wp:inline distT="0" distB="0" distL="0" distR="0" wp14:anchorId="48705B36" wp14:editId="1D40C985">
             <wp:extent cx="5731510" cy="6042025"/>
@@ -123,6 +146,9 @@
     <w:p/>
     <w:p>
       <w:r>
+        <w:rPr>
+          <w:noProof/>
+        </w:rPr>
         <w:lastRenderedPageBreak/>
         <w:drawing>
           <wp:inline distT="0" distB="0" distL="0" distR="0" wp14:anchorId="067151DD" wp14:editId="493118A9">
@@ -164,6 +190,9 @@
     <w:p/>
     <w:p>
       <w:r>
+        <w:rPr>
+          <w:noProof/>
+        </w:rPr>
         <w:lastRenderedPageBreak/>
         <w:drawing>
           <wp:inline distT="0" distB="0" distL="0" distR="0" wp14:anchorId="7632C3AC" wp14:editId="134A0FCD">
@@ -210,11 +239,68 @@
           <w:bCs/>
         </w:rPr>
       </w:pPr>
-      <w:r>
-        <w:rPr>
-          <w:b/>
-          <w:bCs/>
-        </w:rPr>
+    </w:p>
+    <w:p>
+      <w:pPr>
+        <w:rPr>
+          <w:b/>
+          <w:bCs/>
+        </w:rPr>
+      </w:pPr>
+    </w:p>
+    <w:p>
+      <w:pPr>
+        <w:rPr>
+          <w:b/>
+          <w:bCs/>
+        </w:rPr>
+      </w:pPr>
+    </w:p>
+    <w:p>
+      <w:pPr>
+        <w:rPr>
+          <w:b/>
+          <w:bCs/>
+        </w:rPr>
+      </w:pPr>
+    </w:p>
+    <w:p>
+      <w:pPr>
+        <w:rPr>
+          <w:b/>
+          <w:bCs/>
+        </w:rPr>
+      </w:pPr>
+    </w:p>
+    <w:p>
+      <w:pPr>
+        <w:rPr>
+          <w:b/>
+          <w:bCs/>
+        </w:rPr>
+      </w:pPr>
+    </w:p>
+    <w:p>
+      <w:pPr>
+        <w:rPr>
+          <w:b/>
+          <w:bCs/>
+        </w:rPr>
+      </w:pPr>
+    </w:p>
+    <w:p>
+      <w:pPr>
+        <w:rPr>
+          <w:b/>
+          <w:bCs/>
+        </w:rPr>
+      </w:pPr>
+      <w:r>
+        <w:rPr>
+          <w:b/>
+          <w:bCs/>
+        </w:rPr>
+        <w:lastRenderedPageBreak/>
         <w:t xml:space="preserve">2) </w:t>
       </w:r>
       <w:r>
@@ -222,7 +308,23 @@
           <w:b/>
           <w:bCs/>
         </w:rPr>
-        <w:t>Capture &amp; Analyze DNS, TCP, UDP using Wireshark</w:t>
+        <w:t xml:space="preserve">Capture &amp; </w:t>
+      </w:r>
+      <w:proofErr w:type="spellStart"/>
+      <w:r>
+        <w:rPr>
+          <w:b/>
+          <w:bCs/>
+        </w:rPr>
+        <w:t>Analyze</w:t>
+      </w:r>
+      <w:proofErr w:type="spellEnd"/>
+      <w:r>
+        <w:rPr>
+          <w:b/>
+          <w:bCs/>
+        </w:rPr>
+        <w:t xml:space="preserve"> DNS, TCP, UDP using Wireshark</w:t>
       </w:r>
       <w:r>
         <w:rPr>
@@ -247,28 +349,217 @@
           <w:bCs/>
         </w:rPr>
       </w:pPr>
-    </w:p>
-    <w:p>
-      <w:pPr>
-        <w:rPr>
-          <w:b/>
-          <w:bCs/>
-        </w:rPr>
-      </w:pPr>
-    </w:p>
-    <w:p/>
-    <w:p>
-      <w:r>
-        <w:t>3)</w:t>
-      </w:r>
-    </w:p>
-    <w:p>
-      <w:r>
+      <w:r>
+        <w:rPr>
+          <w:noProof/>
+        </w:rPr>
+        <w:drawing>
+          <wp:inline distT="0" distB="0" distL="0" distR="0" wp14:anchorId="07CF5A92" wp14:editId="0CC34E8C">
+            <wp:extent cx="5731510" cy="3188335"/>
+            <wp:effectExtent l="0" t="0" r="2540" b="0"/>
+            <wp:docPr id="128308417" name="Picture 1" descr="image"/>
+            <wp:cNvGraphicFramePr>
+              <a:graphicFrameLocks xmlns:a="http://schemas.openxmlformats.org/drawingml/2006/main" noChangeAspect="1"/>
+            </wp:cNvGraphicFramePr>
+            <a:graphic xmlns:a="http://schemas.openxmlformats.org/drawingml/2006/main">
+              <a:graphicData uri="http://schemas.openxmlformats.org/drawingml/2006/picture">
+                <pic:pic xmlns:pic="http://schemas.openxmlformats.org/drawingml/2006/picture">
+                  <pic:nvPicPr>
+                    <pic:cNvPr id="0" name="Picture 1" descr="image"/>
+                    <pic:cNvPicPr>
+                      <a:picLocks noChangeAspect="1" noChangeArrowheads="1"/>
+                    </pic:cNvPicPr>
+                  </pic:nvPicPr>
+                  <pic:blipFill>
+                    <a:blip r:embed="rId8" cstate="print">
+                      <a:extLst>
+                        <a:ext uri="{28A0092B-C50C-407E-A947-70E740481C1C}">
+                          <a14:useLocalDpi xmlns:a14="http://schemas.microsoft.com/office/drawing/2010/main" val="0"/>
+                        </a:ext>
+                      </a:extLst>
+                    </a:blip>
+                    <a:srcRect/>
+                    <a:stretch>
+                      <a:fillRect/>
+                    </a:stretch>
+                  </pic:blipFill>
+                  <pic:spPr bwMode="auto">
+                    <a:xfrm>
+                      <a:off x="0" y="0"/>
+                      <a:ext cx="5731510" cy="3188335"/>
+                    </a:xfrm>
+                    <a:prstGeom prst="rect">
+                      <a:avLst/>
+                    </a:prstGeom>
+                    <a:noFill/>
+                    <a:ln>
+                      <a:noFill/>
+                    </a:ln>
+                  </pic:spPr>
+                </pic:pic>
+              </a:graphicData>
+            </a:graphic>
+          </wp:inline>
+        </w:drawing>
+      </w:r>
+    </w:p>
+    <w:p>
+      <w:pPr>
+        <w:rPr>
+          <w:b/>
+          <w:bCs/>
+        </w:rPr>
+      </w:pPr>
+      <w:r>
+        <w:rPr>
+          <w:noProof/>
+        </w:rPr>
+        <w:drawing>
+          <wp:inline distT="0" distB="0" distL="0" distR="0" wp14:anchorId="1643F1D5" wp14:editId="78CFD2A1">
+            <wp:extent cx="5731510" cy="3567430"/>
+            <wp:effectExtent l="0" t="0" r="2540" b="0"/>
+            <wp:docPr id="2113993823" name="Picture 2" descr="image"/>
+            <wp:cNvGraphicFramePr>
+              <a:graphicFrameLocks xmlns:a="http://schemas.openxmlformats.org/drawingml/2006/main" noChangeAspect="1"/>
+            </wp:cNvGraphicFramePr>
+            <a:graphic xmlns:a="http://schemas.openxmlformats.org/drawingml/2006/main">
+              <a:graphicData uri="http://schemas.openxmlformats.org/drawingml/2006/picture">
+                <pic:pic xmlns:pic="http://schemas.openxmlformats.org/drawingml/2006/picture">
+                  <pic:nvPicPr>
+                    <pic:cNvPr id="0" name="Picture 3" descr="image"/>
+                    <pic:cNvPicPr>
+                      <a:picLocks noChangeAspect="1" noChangeArrowheads="1"/>
+                    </pic:cNvPicPr>
+                  </pic:nvPicPr>
+                  <pic:blipFill>
+                    <a:blip r:embed="rId9" cstate="print">
+                      <a:extLst>
+                        <a:ext uri="{28A0092B-C50C-407E-A947-70E740481C1C}">
+                          <a14:useLocalDpi xmlns:a14="http://schemas.microsoft.com/office/drawing/2010/main" val="0"/>
+                        </a:ext>
+                      </a:extLst>
+                    </a:blip>
+                    <a:srcRect/>
+                    <a:stretch>
+                      <a:fillRect/>
+                    </a:stretch>
+                  </pic:blipFill>
+                  <pic:spPr bwMode="auto">
+                    <a:xfrm>
+                      <a:off x="0" y="0"/>
+                      <a:ext cx="5731510" cy="3567430"/>
+                    </a:xfrm>
+                    <a:prstGeom prst="rect">
+                      <a:avLst/>
+                    </a:prstGeom>
+                    <a:noFill/>
+                    <a:ln>
+                      <a:noFill/>
+                    </a:ln>
+                  </pic:spPr>
+                </pic:pic>
+              </a:graphicData>
+            </a:graphic>
+          </wp:inline>
+        </w:drawing>
+      </w:r>
+    </w:p>
+    <w:p>
+      <w:pPr>
+        <w:rPr>
+          <w:b/>
+          <w:bCs/>
+        </w:rPr>
+      </w:pPr>
+      <w:r>
+        <w:rPr>
+          <w:noProof/>
+        </w:rPr>
         <w:lastRenderedPageBreak/>
         <w:drawing>
-          <wp:inline distT="0" distB="0" distL="0" distR="0" wp14:anchorId="1AAF122E" wp14:editId="4AB6B6C9">
-            <wp:extent cx="5731510" cy="6042025"/>
+          <wp:inline distT="0" distB="0" distL="0" distR="0" wp14:anchorId="5E2B4F2B" wp14:editId="366FC470">
+            <wp:extent cx="5731510" cy="3011805"/>
             <wp:effectExtent l="0" t="0" r="2540" b="0"/>
+            <wp:docPr id="1622709988" name="Picture 3" descr="image"/>
+            <wp:cNvGraphicFramePr>
+              <a:graphicFrameLocks xmlns:a="http://schemas.openxmlformats.org/drawingml/2006/main" noChangeAspect="1"/>
+            </wp:cNvGraphicFramePr>
+            <a:graphic xmlns:a="http://schemas.openxmlformats.org/drawingml/2006/main">
+              <a:graphicData uri="http://schemas.openxmlformats.org/drawingml/2006/picture">
+                <pic:pic xmlns:pic="http://schemas.openxmlformats.org/drawingml/2006/picture">
+                  <pic:nvPicPr>
+                    <pic:cNvPr id="0" name="Picture 5" descr="image"/>
+                    <pic:cNvPicPr>
+                      <a:picLocks noChangeAspect="1" noChangeArrowheads="1"/>
+                    </pic:cNvPicPr>
+                  </pic:nvPicPr>
+                  <pic:blipFill>
+                    <a:blip r:embed="rId10" cstate="print">
+                      <a:extLst>
+                        <a:ext uri="{28A0092B-C50C-407E-A947-70E740481C1C}">
+                          <a14:useLocalDpi xmlns:a14="http://schemas.microsoft.com/office/drawing/2010/main" val="0"/>
+                        </a:ext>
+                      </a:extLst>
+                    </a:blip>
+                    <a:srcRect/>
+                    <a:stretch>
+                      <a:fillRect/>
+                    </a:stretch>
+                  </pic:blipFill>
+                  <pic:spPr bwMode="auto">
+                    <a:xfrm>
+                      <a:off x="0" y="0"/>
+                      <a:ext cx="5731510" cy="3011805"/>
+                    </a:xfrm>
+                    <a:prstGeom prst="rect">
+                      <a:avLst/>
+                    </a:prstGeom>
+                    <a:noFill/>
+                    <a:ln>
+                      <a:noFill/>
+                    </a:ln>
+                  </pic:spPr>
+                </pic:pic>
+              </a:graphicData>
+            </a:graphic>
+          </wp:inline>
+        </w:drawing>
+      </w:r>
+    </w:p>
+    <w:p>
+      <w:pPr>
+        <w:rPr>
+          <w:b/>
+          <w:bCs/>
+        </w:rPr>
+      </w:pPr>
+    </w:p>
+    <w:p/>
+    <w:p>
+      <w:r>
+        <w:t>3)</w:t>
+      </w:r>
+      <w:r>
+        <w:t xml:space="preserve">  </w:t>
+      </w:r>
+      <w:proofErr w:type="spellStart"/>
+      <w:r>
+        <w:t>Tracert</w:t>
+      </w:r>
+      <w:proofErr w:type="spellEnd"/>
+      <w:r>
+        <w:t xml:space="preserve"> </w:t>
+      </w:r>
+    </w:p>
+    <w:p>
+      <w:r>
+        <w:rPr>
+          <w:noProof/>
+        </w:rPr>
+        <w:drawing>
+          <wp:inline distT="0" distB="0" distL="0" distR="0" wp14:anchorId="1AAF122E" wp14:editId="5B05D8D8">
+            <wp:extent cx="3465442" cy="3653188"/>
+            <wp:effectExtent l="0" t="0" r="1905" b="4445"/>
             <wp:docPr id="1817182888" name="Picture 1"/>
             <wp:cNvGraphicFramePr>
               <a:graphicFrameLocks xmlns:a="http://schemas.openxmlformats.org/drawingml/2006/main" noChangeAspect="1"/>
@@ -281,7 +572,177 @@
                     <pic:cNvPicPr/>
                   </pic:nvPicPr>
                   <pic:blipFill>
-                    <a:blip r:embed="rId8"/>
+                    <a:blip r:embed="rId11"/>
+                    <a:stretch>
+                      <a:fillRect/>
+                    </a:stretch>
+                  </pic:blipFill>
+                  <pic:spPr>
+                    <a:xfrm>
+                      <a:off x="0" y="0"/>
+                      <a:ext cx="3479193" cy="3667684"/>
+                    </a:xfrm>
+                    <a:prstGeom prst="rect">
+                      <a:avLst/>
+                    </a:prstGeom>
+                  </pic:spPr>
+                </pic:pic>
+              </a:graphicData>
+            </a:graphic>
+          </wp:inline>
+        </w:drawing>
+      </w:r>
+    </w:p>
+    <w:p>
+      <w:r>
+        <w:rPr>
+          <w:noProof/>
+        </w:rPr>
+        <w:lastRenderedPageBreak/>
+        <w:drawing>
+          <wp:inline distT="0" distB="0" distL="0" distR="0" wp14:anchorId="5F3FF7D2" wp14:editId="112B0254">
+            <wp:extent cx="4339438" cy="4574535"/>
+            <wp:effectExtent l="0" t="0" r="4445" b="0"/>
+            <wp:docPr id="765219632" name="Picture 1"/>
+            <wp:cNvGraphicFramePr>
+              <a:graphicFrameLocks xmlns:a="http://schemas.openxmlformats.org/drawingml/2006/main" noChangeAspect="1"/>
+            </wp:cNvGraphicFramePr>
+            <a:graphic xmlns:a="http://schemas.openxmlformats.org/drawingml/2006/main">
+              <a:graphicData uri="http://schemas.openxmlformats.org/drawingml/2006/picture">
+                <pic:pic xmlns:pic="http://schemas.openxmlformats.org/drawingml/2006/picture">
+                  <pic:nvPicPr>
+                    <pic:cNvPr id="765219632" name=""/>
+                    <pic:cNvPicPr/>
+                  </pic:nvPicPr>
+                  <pic:blipFill>
+                    <a:blip r:embed="rId12"/>
+                    <a:stretch>
+                      <a:fillRect/>
+                    </a:stretch>
+                  </pic:blipFill>
+                  <pic:spPr>
+                    <a:xfrm>
+                      <a:off x="0" y="0"/>
+                      <a:ext cx="4347945" cy="4583503"/>
+                    </a:xfrm>
+                    <a:prstGeom prst="rect">
+                      <a:avLst/>
+                    </a:prstGeom>
+                  </pic:spPr>
+                </pic:pic>
+              </a:graphicData>
+            </a:graphic>
+          </wp:inline>
+        </w:drawing>
+      </w:r>
+    </w:p>
+    <w:p/>
+    <w:p>
+      <w:r>
+        <w:t>5</w:t>
+      </w:r>
+      <w:r>
+        <w:t>)</w:t>
+      </w:r>
+    </w:p>
+    <w:p>
+      <w:pPr>
+        <w:pStyle w:val="ListParagraph"/>
+        <w:numPr>
+          <w:ilvl w:val="0"/>
+          <w:numId w:val="3"/>
+        </w:numPr>
+      </w:pPr>
+      <w:r>
+        <w:t xml:space="preserve">VLAN (Virtual LAN) is used to logically divide a physical network into multiple smaller networks. </w:t>
+      </w:r>
+    </w:p>
+    <w:p>
+      <w:pPr>
+        <w:pStyle w:val="ListParagraph"/>
+        <w:numPr>
+          <w:ilvl w:val="0"/>
+          <w:numId w:val="3"/>
+        </w:numPr>
+      </w:pPr>
+      <w:r>
+        <w:t xml:space="preserve">It improves security, reduces broadcast traffic, and enhances performance. </w:t>
+      </w:r>
+    </w:p>
+    <w:p>
+      <w:pPr>
+        <w:pStyle w:val="ListParagraph"/>
+        <w:numPr>
+          <w:ilvl w:val="0"/>
+          <w:numId w:val="3"/>
+        </w:numPr>
+      </w:pPr>
+      <w:r>
+        <w:t xml:space="preserve">Devices in the same VLAN can communicate directly. </w:t>
+      </w:r>
+    </w:p>
+    <w:p>
+      <w:pPr>
+        <w:pStyle w:val="ListParagraph"/>
+        <w:numPr>
+          <w:ilvl w:val="0"/>
+          <w:numId w:val="3"/>
+        </w:numPr>
+      </w:pPr>
+      <w:r>
+        <w:t xml:space="preserve">Devices in different VLANs require a router for communication. </w:t>
+      </w:r>
+    </w:p>
+    <w:p>
+      <w:pPr>
+        <w:pStyle w:val="ListParagraph"/>
+        <w:numPr>
+          <w:ilvl w:val="0"/>
+          <w:numId w:val="3"/>
+        </w:numPr>
+      </w:pPr>
+      <w:r>
+        <w:t xml:space="preserve">Access ports connect end devices and carry a single VLAN. </w:t>
+      </w:r>
+    </w:p>
+    <w:p>
+      <w:pPr>
+        <w:pStyle w:val="ListParagraph"/>
+        <w:numPr>
+          <w:ilvl w:val="0"/>
+          <w:numId w:val="3"/>
+        </w:numPr>
+      </w:pPr>
+      <w:r>
+        <w:t>Trunk ports carry multiple VLANs between switches using VLAN tagging.</w:t>
+      </w:r>
+    </w:p>
+    <w:p>
+      <w:pPr>
+        <w:pStyle w:val="ListParagraph"/>
+      </w:pPr>
+      <w:r>
+        <w:rPr>
+          <w:noProof/>
+        </w:rPr>
+        <w:lastRenderedPageBreak/>
+        <w:drawing>
+          <wp:inline distT="0" distB="0" distL="0" distR="0" wp14:anchorId="0EFEF257" wp14:editId="550AB8AB">
+            <wp:extent cx="5731510" cy="6042025"/>
+            <wp:effectExtent l="0" t="0" r="2540" b="0"/>
+            <wp:docPr id="397282819" name="Picture 1"/>
+            <wp:cNvGraphicFramePr>
+              <a:graphicFrameLocks xmlns:a="http://schemas.openxmlformats.org/drawingml/2006/main" noChangeAspect="1"/>
+            </wp:cNvGraphicFramePr>
+            <a:graphic xmlns:a="http://schemas.openxmlformats.org/drawingml/2006/main">
+              <a:graphicData uri="http://schemas.openxmlformats.org/drawingml/2006/picture">
+                <pic:pic xmlns:pic="http://schemas.openxmlformats.org/drawingml/2006/picture">
+                  <pic:nvPicPr>
+                    <pic:cNvPr id="397282819" name=""/>
+                    <pic:cNvPicPr/>
+                  </pic:nvPicPr>
+                  <pic:blipFill>
+                    <a:blip r:embed="rId13"/>
                     <a:stretch>
                       <a:fillRect/>
                     </a:stretch>
@@ -302,173 +763,9 @@
         </w:drawing>
       </w:r>
     </w:p>
-    <w:p>
-      <w:r>
-        <w:lastRenderedPageBreak/>
-        <w:drawing>
-          <wp:inline distT="0" distB="0" distL="0" distR="0" wp14:anchorId="5F3FF7D2" wp14:editId="62F5ECEA">
-            <wp:extent cx="5731510" cy="6042025"/>
-            <wp:effectExtent l="0" t="0" r="2540" b="0"/>
-            <wp:docPr id="765219632" name="Picture 1"/>
-            <wp:cNvGraphicFramePr>
-              <a:graphicFrameLocks xmlns:a="http://schemas.openxmlformats.org/drawingml/2006/main" noChangeAspect="1"/>
-            </wp:cNvGraphicFramePr>
-            <a:graphic xmlns:a="http://schemas.openxmlformats.org/drawingml/2006/main">
-              <a:graphicData uri="http://schemas.openxmlformats.org/drawingml/2006/picture">
-                <pic:pic xmlns:pic="http://schemas.openxmlformats.org/drawingml/2006/picture">
-                  <pic:nvPicPr>
-                    <pic:cNvPr id="765219632" name=""/>
-                    <pic:cNvPicPr/>
-                  </pic:nvPicPr>
-                  <pic:blipFill>
-                    <a:blip r:embed="rId9"/>
-                    <a:stretch>
-                      <a:fillRect/>
-                    </a:stretch>
-                  </pic:blipFill>
-                  <pic:spPr>
-                    <a:xfrm>
-                      <a:off x="0" y="0"/>
-                      <a:ext cx="5731510" cy="6042025"/>
-                    </a:xfrm>
-                    <a:prstGeom prst="rect">
-                      <a:avLst/>
-                    </a:prstGeom>
-                  </pic:spPr>
-                </pic:pic>
-              </a:graphicData>
-            </a:graphic>
-          </wp:inline>
-        </w:drawing>
-      </w:r>
-    </w:p>
     <w:p/>
     <w:p>
       <w:r>
-        <w:t>5</w:t>
-      </w:r>
-      <w:r>
-        <w:t>)</w:t>
-      </w:r>
-    </w:p>
-    <w:p>
-      <w:pPr>
-        <w:pStyle w:val="ListParagraph"/>
-        <w:numPr>
-          <w:ilvl w:val="0"/>
-          <w:numId w:val="3"/>
-        </w:numPr>
-      </w:pPr>
-      <w:r>
-        <w:t xml:space="preserve">VLAN (Virtual LAN) is used to logically divide a physical network into multiple smaller networks. </w:t>
-      </w:r>
-    </w:p>
-    <w:p>
-      <w:pPr>
-        <w:pStyle w:val="ListParagraph"/>
-        <w:numPr>
-          <w:ilvl w:val="0"/>
-          <w:numId w:val="3"/>
-        </w:numPr>
-      </w:pPr>
-      <w:r>
-        <w:t xml:space="preserve">It improves security, reduces broadcast traffic, and enhances performance. </w:t>
-      </w:r>
-    </w:p>
-    <w:p>
-      <w:pPr>
-        <w:pStyle w:val="ListParagraph"/>
-        <w:numPr>
-          <w:ilvl w:val="0"/>
-          <w:numId w:val="3"/>
-        </w:numPr>
-      </w:pPr>
-      <w:r>
-        <w:t xml:space="preserve">Devices in the same VLAN can communicate directly. </w:t>
-      </w:r>
-    </w:p>
-    <w:p>
-      <w:pPr>
-        <w:pStyle w:val="ListParagraph"/>
-        <w:numPr>
-          <w:ilvl w:val="0"/>
-          <w:numId w:val="3"/>
-        </w:numPr>
-      </w:pPr>
-      <w:r>
-        <w:t xml:space="preserve">Devices in different VLANs require a router for communication. </w:t>
-      </w:r>
-    </w:p>
-    <w:p>
-      <w:pPr>
-        <w:pStyle w:val="ListParagraph"/>
-        <w:numPr>
-          <w:ilvl w:val="0"/>
-          <w:numId w:val="3"/>
-        </w:numPr>
-      </w:pPr>
-      <w:r>
-        <w:t xml:space="preserve">Access ports connect end devices and carry a single VLAN. </w:t>
-      </w:r>
-    </w:p>
-    <w:p>
-      <w:pPr>
-        <w:pStyle w:val="ListParagraph"/>
-        <w:numPr>
-          <w:ilvl w:val="0"/>
-          <w:numId w:val="3"/>
-        </w:numPr>
-      </w:pPr>
-      <w:r>
-        <w:t>Trunk ports carry multiple VLANs between switches using VLAN tagging.</w:t>
-      </w:r>
-    </w:p>
-    <w:p>
-      <w:pPr>
-        <w:pStyle w:val="ListParagraph"/>
-      </w:pPr>
-      <w:r>
-        <w:lastRenderedPageBreak/>
-        <w:drawing>
-          <wp:inline distT="0" distB="0" distL="0" distR="0" wp14:anchorId="0EFEF257" wp14:editId="550AB8AB">
-            <wp:extent cx="5731510" cy="6042025"/>
-            <wp:effectExtent l="0" t="0" r="2540" b="0"/>
-            <wp:docPr id="397282819" name="Picture 1"/>
-            <wp:cNvGraphicFramePr>
-              <a:graphicFrameLocks xmlns:a="http://schemas.openxmlformats.org/drawingml/2006/main" noChangeAspect="1"/>
-            </wp:cNvGraphicFramePr>
-            <a:graphic xmlns:a="http://schemas.openxmlformats.org/drawingml/2006/main">
-              <a:graphicData uri="http://schemas.openxmlformats.org/drawingml/2006/picture">
-                <pic:pic xmlns:pic="http://schemas.openxmlformats.org/drawingml/2006/picture">
-                  <pic:nvPicPr>
-                    <pic:cNvPr id="397282819" name=""/>
-                    <pic:cNvPicPr/>
-                  </pic:nvPicPr>
-                  <pic:blipFill>
-                    <a:blip r:embed="rId10"/>
-                    <a:stretch>
-                      <a:fillRect/>
-                    </a:stretch>
-                  </pic:blipFill>
-                  <pic:spPr>
-                    <a:xfrm>
-                      <a:off x="0" y="0"/>
-                      <a:ext cx="5731510" cy="6042025"/>
-                    </a:xfrm>
-                    <a:prstGeom prst="rect">
-                      <a:avLst/>
-                    </a:prstGeom>
-                  </pic:spPr>
-                </pic:pic>
-              </a:graphicData>
-            </a:graphic>
-          </wp:inline>
-        </w:drawing>
-      </w:r>
-    </w:p>
-    <w:p/>
-    <w:p>
-      <w:r>
         <w:t>While we ping the device</w:t>
       </w:r>
       <w:r>
@@ -477,6 +774,9 @@
     </w:p>
     <w:p>
       <w:r>
+        <w:rPr>
+          <w:noProof/>
+        </w:rPr>
         <w:lastRenderedPageBreak/>
         <w:drawing>
           <wp:inline distT="0" distB="0" distL="0" distR="0" wp14:anchorId="64F6BEE1" wp14:editId="6905A37E">
@@ -491,129 +791,6 @@
                 <pic:pic xmlns:pic="http://schemas.openxmlformats.org/drawingml/2006/picture">
                   <pic:nvPicPr>
                     <pic:cNvPr id="1358056574" name=""/>
-                    <pic:cNvPicPr/>
-                  </pic:nvPicPr>
-                  <pic:blipFill>
-                    <a:blip r:embed="rId11"/>
-                    <a:stretch>
-                      <a:fillRect/>
-                    </a:stretch>
-                  </pic:blipFill>
-                  <pic:spPr>
-                    <a:xfrm>
-                      <a:off x="0" y="0"/>
-                      <a:ext cx="4172532" cy="4134427"/>
-                    </a:xfrm>
-                    <a:prstGeom prst="rect">
-                      <a:avLst/>
-                    </a:prstGeom>
-                  </pic:spPr>
-                </pic:pic>
-              </a:graphicData>
-            </a:graphic>
-          </wp:inline>
-        </w:drawing>
-      </w:r>
-    </w:p>
-    <w:p>
-      <w:r>
-        <w:t>Switch 1 configuration :</w:t>
-      </w:r>
-    </w:p>
-    <w:p>
-      <w:r>
-        <w:drawing>
-          <wp:inline distT="0" distB="0" distL="0" distR="0" wp14:anchorId="2C19BFEA" wp14:editId="72E4496C">
-            <wp:extent cx="4172532" cy="4134427"/>
-            <wp:effectExtent l="0" t="0" r="0" b="0"/>
-            <wp:docPr id="757708902" name="Picture 1"/>
-            <wp:cNvGraphicFramePr>
-              <a:graphicFrameLocks xmlns:a="http://schemas.openxmlformats.org/drawingml/2006/main" noChangeAspect="1"/>
-            </wp:cNvGraphicFramePr>
-            <a:graphic xmlns:a="http://schemas.openxmlformats.org/drawingml/2006/main">
-              <a:graphicData uri="http://schemas.openxmlformats.org/drawingml/2006/picture">
-                <pic:pic xmlns:pic="http://schemas.openxmlformats.org/drawingml/2006/picture">
-                  <pic:nvPicPr>
-                    <pic:cNvPr id="757708902" name=""/>
-                    <pic:cNvPicPr/>
-                  </pic:nvPicPr>
-                  <pic:blipFill>
-                    <a:blip r:embed="rId12"/>
-                    <a:stretch>
-                      <a:fillRect/>
-                    </a:stretch>
-                  </pic:blipFill>
-                  <pic:spPr>
-                    <a:xfrm>
-                      <a:off x="0" y="0"/>
-                      <a:ext cx="4172532" cy="4134427"/>
-                    </a:xfrm>
-                    <a:prstGeom prst="rect">
-                      <a:avLst/>
-                    </a:prstGeom>
-                  </pic:spPr>
-                </pic:pic>
-              </a:graphicData>
-            </a:graphic>
-          </wp:inline>
-        </w:drawing>
-      </w:r>
-    </w:p>
-    <w:p>
-      <w:r>
-        <w:lastRenderedPageBreak/>
-        <w:drawing>
-          <wp:inline distT="0" distB="0" distL="0" distR="0" wp14:anchorId="5B130825" wp14:editId="042C64D0">
-            <wp:extent cx="4172532" cy="4134427"/>
-            <wp:effectExtent l="0" t="0" r="0" b="0"/>
-            <wp:docPr id="1691903884" name="Picture 1"/>
-            <wp:cNvGraphicFramePr>
-              <a:graphicFrameLocks xmlns:a="http://schemas.openxmlformats.org/drawingml/2006/main" noChangeAspect="1"/>
-            </wp:cNvGraphicFramePr>
-            <a:graphic xmlns:a="http://schemas.openxmlformats.org/drawingml/2006/main">
-              <a:graphicData uri="http://schemas.openxmlformats.org/drawingml/2006/picture">
-                <pic:pic xmlns:pic="http://schemas.openxmlformats.org/drawingml/2006/picture">
-                  <pic:nvPicPr>
-                    <pic:cNvPr id="1691903884" name=""/>
-                    <pic:cNvPicPr/>
-                  </pic:nvPicPr>
-                  <pic:blipFill>
-                    <a:blip r:embed="rId13"/>
-                    <a:stretch>
-                      <a:fillRect/>
-                    </a:stretch>
-                  </pic:blipFill>
-                  <pic:spPr>
-                    <a:xfrm>
-                      <a:off x="0" y="0"/>
-                      <a:ext cx="4172532" cy="4134427"/>
-                    </a:xfrm>
-                    <a:prstGeom prst="rect">
-                      <a:avLst/>
-                    </a:prstGeom>
-                  </pic:spPr>
-                </pic:pic>
-              </a:graphicData>
-            </a:graphic>
-          </wp:inline>
-        </w:drawing>
-      </w:r>
-    </w:p>
-    <w:p>
-      <w:r>
-        <w:drawing>
-          <wp:inline distT="0" distB="0" distL="0" distR="0" wp14:anchorId="6B223B06" wp14:editId="1B3F4CEB">
-            <wp:extent cx="4172532" cy="4134427"/>
-            <wp:effectExtent l="0" t="0" r="0" b="0"/>
-            <wp:docPr id="1984421783" name="Picture 1"/>
-            <wp:cNvGraphicFramePr>
-              <a:graphicFrameLocks xmlns:a="http://schemas.openxmlformats.org/drawingml/2006/main" noChangeAspect="1"/>
-            </wp:cNvGraphicFramePr>
-            <a:graphic xmlns:a="http://schemas.openxmlformats.org/drawingml/2006/main">
-              <a:graphicData uri="http://schemas.openxmlformats.org/drawingml/2006/picture">
-                <pic:pic xmlns:pic="http://schemas.openxmlformats.org/drawingml/2006/picture">
-                  <pic:nvPicPr>
-                    <pic:cNvPr id="1984421783" name=""/>
                     <pic:cNvPicPr/>
                   </pic:nvPicPr>
                   <pic:blipFill>
@@ -638,20 +815,21 @@
         </w:drawing>
       </w:r>
     </w:p>
-    <w:p/>
-    <w:p>
-      <w:r>
-        <w:lastRenderedPageBreak/>
-        <w:t>Switch 2 configuration :</w:t>
-      </w:r>
-    </w:p>
-    <w:p>
-      <w:r>
+    <w:p>
+      <w:r>
+        <w:t>Switch 1 configuration :</w:t>
+      </w:r>
+    </w:p>
+    <w:p>
+      <w:r>
+        <w:rPr>
+          <w:noProof/>
+        </w:rPr>
         <w:drawing>
-          <wp:inline distT="0" distB="0" distL="0" distR="0" wp14:anchorId="430AA478" wp14:editId="0A546757">
+          <wp:inline distT="0" distB="0" distL="0" distR="0" wp14:anchorId="2C19BFEA" wp14:editId="72E4496C">
             <wp:extent cx="4172532" cy="4134427"/>
             <wp:effectExtent l="0" t="0" r="0" b="0"/>
-            <wp:docPr id="2018381794" name="Picture 1"/>
+            <wp:docPr id="757708902" name="Picture 1"/>
             <wp:cNvGraphicFramePr>
               <a:graphicFrameLocks xmlns:a="http://schemas.openxmlformats.org/drawingml/2006/main" noChangeAspect="1"/>
             </wp:cNvGraphicFramePr>
@@ -659,7 +837,7 @@
               <a:graphicData uri="http://schemas.openxmlformats.org/drawingml/2006/picture">
                 <pic:pic xmlns:pic="http://schemas.openxmlformats.org/drawingml/2006/picture">
                   <pic:nvPicPr>
-                    <pic:cNvPr id="2018381794" name=""/>
+                    <pic:cNvPr id="757708902" name=""/>
                     <pic:cNvPicPr/>
                   </pic:nvPicPr>
                   <pic:blipFill>
@@ -686,11 +864,15 @@
     </w:p>
     <w:p>
       <w:r>
+        <w:rPr>
+          <w:noProof/>
+        </w:rPr>
+        <w:lastRenderedPageBreak/>
         <w:drawing>
-          <wp:inline distT="0" distB="0" distL="0" distR="0" wp14:anchorId="0430D2A7" wp14:editId="600E11EE">
+          <wp:inline distT="0" distB="0" distL="0" distR="0" wp14:anchorId="5B130825" wp14:editId="042C64D0">
             <wp:extent cx="4172532" cy="4134427"/>
             <wp:effectExtent l="0" t="0" r="0" b="0"/>
-            <wp:docPr id="612050070" name="Picture 1"/>
+            <wp:docPr id="1691903884" name="Picture 1"/>
             <wp:cNvGraphicFramePr>
               <a:graphicFrameLocks xmlns:a="http://schemas.openxmlformats.org/drawingml/2006/main" noChangeAspect="1"/>
             </wp:cNvGraphicFramePr>
@@ -698,7 +880,7 @@
               <a:graphicData uri="http://schemas.openxmlformats.org/drawingml/2006/picture">
                 <pic:pic xmlns:pic="http://schemas.openxmlformats.org/drawingml/2006/picture">
                   <pic:nvPicPr>
-                    <pic:cNvPr id="612050070" name=""/>
+                    <pic:cNvPr id="1691903884" name=""/>
                     <pic:cNvPicPr/>
                   </pic:nvPicPr>
                   <pic:blipFill>
@@ -725,6 +907,139 @@
     </w:p>
     <w:p>
       <w:r>
+        <w:rPr>
+          <w:noProof/>
+        </w:rPr>
+        <w:drawing>
+          <wp:inline distT="0" distB="0" distL="0" distR="0" wp14:anchorId="6B223B06" wp14:editId="1B3F4CEB">
+            <wp:extent cx="4172532" cy="4134427"/>
+            <wp:effectExtent l="0" t="0" r="0" b="0"/>
+            <wp:docPr id="1984421783" name="Picture 1"/>
+            <wp:cNvGraphicFramePr>
+              <a:graphicFrameLocks xmlns:a="http://schemas.openxmlformats.org/drawingml/2006/main" noChangeAspect="1"/>
+            </wp:cNvGraphicFramePr>
+            <a:graphic xmlns:a="http://schemas.openxmlformats.org/drawingml/2006/main">
+              <a:graphicData uri="http://schemas.openxmlformats.org/drawingml/2006/picture">
+                <pic:pic xmlns:pic="http://schemas.openxmlformats.org/drawingml/2006/picture">
+                  <pic:nvPicPr>
+                    <pic:cNvPr id="1984421783" name=""/>
+                    <pic:cNvPicPr/>
+                  </pic:nvPicPr>
+                  <pic:blipFill>
+                    <a:blip r:embed="rId17"/>
+                    <a:stretch>
+                      <a:fillRect/>
+                    </a:stretch>
+                  </pic:blipFill>
+                  <pic:spPr>
+                    <a:xfrm>
+                      <a:off x="0" y="0"/>
+                      <a:ext cx="4172532" cy="4134427"/>
+                    </a:xfrm>
+                    <a:prstGeom prst="rect">
+                      <a:avLst/>
+                    </a:prstGeom>
+                  </pic:spPr>
+                </pic:pic>
+              </a:graphicData>
+            </a:graphic>
+          </wp:inline>
+        </w:drawing>
+      </w:r>
+    </w:p>
+    <w:p/>
+    <w:p>
+      <w:r>
+        <w:lastRenderedPageBreak/>
+        <w:t>Switch 2 configuration :</w:t>
+      </w:r>
+    </w:p>
+    <w:p>
+      <w:r>
+        <w:rPr>
+          <w:noProof/>
+        </w:rPr>
+        <w:drawing>
+          <wp:inline distT="0" distB="0" distL="0" distR="0" wp14:anchorId="430AA478" wp14:editId="0A546757">
+            <wp:extent cx="4172532" cy="4134427"/>
+            <wp:effectExtent l="0" t="0" r="0" b="0"/>
+            <wp:docPr id="2018381794" name="Picture 1"/>
+            <wp:cNvGraphicFramePr>
+              <a:graphicFrameLocks xmlns:a="http://schemas.openxmlformats.org/drawingml/2006/main" noChangeAspect="1"/>
+            </wp:cNvGraphicFramePr>
+            <a:graphic xmlns:a="http://schemas.openxmlformats.org/drawingml/2006/main">
+              <a:graphicData uri="http://schemas.openxmlformats.org/drawingml/2006/picture">
+                <pic:pic xmlns:pic="http://schemas.openxmlformats.org/drawingml/2006/picture">
+                  <pic:nvPicPr>
+                    <pic:cNvPr id="2018381794" name=""/>
+                    <pic:cNvPicPr/>
+                  </pic:nvPicPr>
+                  <pic:blipFill>
+                    <a:blip r:embed="rId18"/>
+                    <a:stretch>
+                      <a:fillRect/>
+                    </a:stretch>
+                  </pic:blipFill>
+                  <pic:spPr>
+                    <a:xfrm>
+                      <a:off x="0" y="0"/>
+                      <a:ext cx="4172532" cy="4134427"/>
+                    </a:xfrm>
+                    <a:prstGeom prst="rect">
+                      <a:avLst/>
+                    </a:prstGeom>
+                  </pic:spPr>
+                </pic:pic>
+              </a:graphicData>
+            </a:graphic>
+          </wp:inline>
+        </w:drawing>
+      </w:r>
+    </w:p>
+    <w:p>
+      <w:r>
+        <w:rPr>
+          <w:noProof/>
+        </w:rPr>
+        <w:drawing>
+          <wp:inline distT="0" distB="0" distL="0" distR="0" wp14:anchorId="0430D2A7" wp14:editId="600E11EE">
+            <wp:extent cx="4172532" cy="4134427"/>
+            <wp:effectExtent l="0" t="0" r="0" b="0"/>
+            <wp:docPr id="612050070" name="Picture 1"/>
+            <wp:cNvGraphicFramePr>
+              <a:graphicFrameLocks xmlns:a="http://schemas.openxmlformats.org/drawingml/2006/main" noChangeAspect="1"/>
+            </wp:cNvGraphicFramePr>
+            <a:graphic xmlns:a="http://schemas.openxmlformats.org/drawingml/2006/main">
+              <a:graphicData uri="http://schemas.openxmlformats.org/drawingml/2006/picture">
+                <pic:pic xmlns:pic="http://schemas.openxmlformats.org/drawingml/2006/picture">
+                  <pic:nvPicPr>
+                    <pic:cNvPr id="612050070" name=""/>
+                    <pic:cNvPicPr/>
+                  </pic:nvPicPr>
+                  <pic:blipFill>
+                    <a:blip r:embed="rId19"/>
+                    <a:stretch>
+                      <a:fillRect/>
+                    </a:stretch>
+                  </pic:blipFill>
+                  <pic:spPr>
+                    <a:xfrm>
+                      <a:off x="0" y="0"/>
+                      <a:ext cx="4172532" cy="4134427"/>
+                    </a:xfrm>
+                    <a:prstGeom prst="rect">
+                      <a:avLst/>
+                    </a:prstGeom>
+                  </pic:spPr>
+                </pic:pic>
+              </a:graphicData>
+            </a:graphic>
+          </wp:inline>
+        </w:drawing>
+      </w:r>
+    </w:p>
+    <w:p>
+      <w:r>
         <w:lastRenderedPageBreak/>
         <w:t xml:space="preserve">7) </w:t>
       </w:r>
@@ -735,6 +1050,9 @@
     <w:p/>
     <w:p>
       <w:r>
+        <w:rPr>
+          <w:noProof/>
+        </w:rPr>
         <w:drawing>
           <wp:inline distT="0" distB="0" distL="0" distR="0" wp14:anchorId="7C1366B2" wp14:editId="4FB29744">
             <wp:extent cx="5731510" cy="6042025"/>
@@ -751,7 +1069,7 @@
                     <pic:cNvPicPr/>
                   </pic:nvPicPr>
                   <pic:blipFill>
-                    <a:blip r:embed="rId17"/>
+                    <a:blip r:embed="rId20"/>
                     <a:stretch>
                       <a:fillRect/>
                     </a:stretch>
@@ -796,7 +1114,7 @@
                     </pic:cNvPicPr>
                   </pic:nvPicPr>
                   <pic:blipFill>
-                    <a:blip r:embed="rId18">
+                    <a:blip r:embed="rId21">
                       <a:extLst>
                         <a:ext uri="{28A0092B-C50C-407E-A947-70E740481C1C}">
                           <a14:useLocalDpi xmlns:a14="http://schemas.microsoft.com/office/drawing/2010/main" val="0"/>
@@ -831,6 +1149,9 @@
     <w:p/>
     <w:p>
       <w:r>
+        <w:rPr>
+          <w:noProof/>
+        </w:rPr>
         <w:lastRenderedPageBreak/>
         <w:drawing>
           <wp:inline distT="0" distB="0" distL="0" distR="0" wp14:anchorId="57C0288F" wp14:editId="01E0D7A9">
@@ -848,7 +1169,7 @@
                     <pic:cNvPicPr/>
                   </pic:nvPicPr>
                   <pic:blipFill>
-                    <a:blip r:embed="rId19"/>
+                    <a:blip r:embed="rId22"/>
                     <a:stretch>
                       <a:fillRect/>
                     </a:stretch>
@@ -872,6 +1193,9 @@
     <w:p/>
     <w:p>
       <w:r>
+        <w:rPr>
+          <w:noProof/>
+        </w:rPr>
         <w:lastRenderedPageBreak/>
         <w:drawing>
           <wp:inline distT="0" distB="0" distL="0" distR="0" wp14:anchorId="3E90F670" wp14:editId="4C1F52F6">
@@ -886,179 +1210,6 @@
                 <pic:pic xmlns:pic="http://schemas.openxmlformats.org/drawingml/2006/picture">
                   <pic:nvPicPr>
                     <pic:cNvPr id="1509904718" name=""/>
-                    <pic:cNvPicPr/>
-                  </pic:nvPicPr>
-                  <pic:blipFill>
-                    <a:blip r:embed="rId20"/>
-                    <a:stretch>
-                      <a:fillRect/>
-                    </a:stretch>
-                  </pic:blipFill>
-                  <pic:spPr>
-                    <a:xfrm>
-                      <a:off x="0" y="0"/>
-                      <a:ext cx="5731510" cy="6042025"/>
-                    </a:xfrm>
-                    <a:prstGeom prst="rect">
-                      <a:avLst/>
-                    </a:prstGeom>
-                  </pic:spPr>
-                </pic:pic>
-              </a:graphicData>
-            </a:graphic>
-          </wp:inline>
-        </w:drawing>
-      </w:r>
-    </w:p>
-    <w:p/>
-    <w:p>
-      <w:r>
-        <w:t xml:space="preserve">7) </w:t>
-      </w:r>
-      <w:r>
-        <w:t>Configuration of Management VLAN and Remote Access (SSH/Telnet)</w:t>
-      </w:r>
-      <w:r>
-        <w:t xml:space="preserve"> :</w:t>
-      </w:r>
-    </w:p>
-    <w:p>
-      <w:r>
-        <w:t>A management VLAN is a VLAN used specifically for managing a network device (like a switch) remotely. Instead of configuring the switch only through the console, we assign an IP address to a VLAN interface so that we can access the switch over the network using SSH or Telnet.</w:t>
-      </w:r>
-    </w:p>
-    <w:p>
-      <w:pPr>
-        <w:numPr>
-          <w:ilvl w:val="0"/>
-          <w:numId w:val="7"/>
-        </w:numPr>
-      </w:pPr>
-      <w:r>
-        <w:t>Management VLAN = VLAN used for remote administration</w:t>
-      </w:r>
-    </w:p>
-    <w:p>
-      <w:pPr>
-        <w:numPr>
-          <w:ilvl w:val="0"/>
-          <w:numId w:val="7"/>
-        </w:numPr>
-      </w:pPr>
-      <w:r>
-        <w:t>IP address is assigned to a virtual interface called SVI (Switch Virtual Interface)</w:t>
-      </w:r>
-    </w:p>
-    <w:p>
-      <w:pPr>
-        <w:numPr>
-          <w:ilvl w:val="0"/>
-          <w:numId w:val="7"/>
-        </w:numPr>
-      </w:pPr>
-      <w:r>
-        <w:t>Remote access is done using SSH (secure) or Telnet (not secure)</w:t>
-      </w:r>
-    </w:p>
-    <w:p/>
-    <w:p>
-      <w:r>
-        <w:drawing>
-          <wp:inline distT="0" distB="0" distL="0" distR="0" wp14:anchorId="7B9F838F" wp14:editId="612C97B3">
-            <wp:extent cx="5731510" cy="6042025"/>
-            <wp:effectExtent l="0" t="0" r="2540" b="0"/>
-            <wp:docPr id="395013389" name="Picture 1"/>
-            <wp:cNvGraphicFramePr>
-              <a:graphicFrameLocks xmlns:a="http://schemas.openxmlformats.org/drawingml/2006/main" noChangeAspect="1"/>
-            </wp:cNvGraphicFramePr>
-            <a:graphic xmlns:a="http://schemas.openxmlformats.org/drawingml/2006/main">
-              <a:graphicData uri="http://schemas.openxmlformats.org/drawingml/2006/picture">
-                <pic:pic xmlns:pic="http://schemas.openxmlformats.org/drawingml/2006/picture">
-                  <pic:nvPicPr>
-                    <pic:cNvPr id="395013389" name=""/>
-                    <pic:cNvPicPr/>
-                  </pic:nvPicPr>
-                  <pic:blipFill>
-                    <a:blip r:embed="rId21"/>
-                    <a:stretch>
-                      <a:fillRect/>
-                    </a:stretch>
-                  </pic:blipFill>
-                  <pic:spPr>
-                    <a:xfrm>
-                      <a:off x="0" y="0"/>
-                      <a:ext cx="5731510" cy="6042025"/>
-                    </a:xfrm>
-                    <a:prstGeom prst="rect">
-                      <a:avLst/>
-                    </a:prstGeom>
-                  </pic:spPr>
-                </pic:pic>
-              </a:graphicData>
-            </a:graphic>
-          </wp:inline>
-        </w:drawing>
-      </w:r>
-    </w:p>
-    <w:p/>
-    <w:p/>
-    <w:p/>
-    <w:p>
-      <w:r>
-        <w:lastRenderedPageBreak/>
-        <w:drawing>
-          <wp:inline distT="0" distB="0" distL="0" distR="0" wp14:anchorId="76780628" wp14:editId="06D47D82">
-            <wp:extent cx="5731510" cy="6042025"/>
-            <wp:effectExtent l="0" t="0" r="2540" b="0"/>
-            <wp:docPr id="354082208" name="Picture 1"/>
-            <wp:cNvGraphicFramePr>
-              <a:graphicFrameLocks xmlns:a="http://schemas.openxmlformats.org/drawingml/2006/main" noChangeAspect="1"/>
-            </wp:cNvGraphicFramePr>
-            <a:graphic xmlns:a="http://schemas.openxmlformats.org/drawingml/2006/main">
-              <a:graphicData uri="http://schemas.openxmlformats.org/drawingml/2006/picture">
-                <pic:pic xmlns:pic="http://schemas.openxmlformats.org/drawingml/2006/picture">
-                  <pic:nvPicPr>
-                    <pic:cNvPr id="354082208" name=""/>
-                    <pic:cNvPicPr/>
-                  </pic:nvPicPr>
-                  <pic:blipFill>
-                    <a:blip r:embed="rId22"/>
-                    <a:stretch>
-                      <a:fillRect/>
-                    </a:stretch>
-                  </pic:blipFill>
-                  <pic:spPr>
-                    <a:xfrm>
-                      <a:off x="0" y="0"/>
-                      <a:ext cx="5731510" cy="6042025"/>
-                    </a:xfrm>
-                    <a:prstGeom prst="rect">
-                      <a:avLst/>
-                    </a:prstGeom>
-                  </pic:spPr>
-                </pic:pic>
-              </a:graphicData>
-            </a:graphic>
-          </wp:inline>
-        </w:drawing>
-      </w:r>
-    </w:p>
-    <w:p>
-      <w:r>
-        <w:lastRenderedPageBreak/>
-        <w:drawing>
-          <wp:inline distT="0" distB="0" distL="0" distR="0" wp14:anchorId="22F93603" wp14:editId="27317A22">
-            <wp:extent cx="5731510" cy="6042025"/>
-            <wp:effectExtent l="0" t="0" r="2540" b="0"/>
-            <wp:docPr id="7901690" name="Picture 1"/>
-            <wp:cNvGraphicFramePr>
-              <a:graphicFrameLocks xmlns:a="http://schemas.openxmlformats.org/drawingml/2006/main" noChangeAspect="1"/>
-            </wp:cNvGraphicFramePr>
-            <a:graphic xmlns:a="http://schemas.openxmlformats.org/drawingml/2006/main">
-              <a:graphicData uri="http://schemas.openxmlformats.org/drawingml/2006/picture">
-                <pic:pic xmlns:pic="http://schemas.openxmlformats.org/drawingml/2006/picture">
-                  <pic:nvPicPr>
-                    <pic:cNvPr id="7901690" name=""/>
                     <pic:cNvPicPr/>
                   </pic:nvPicPr>
                   <pic:blipFill>
@@ -1083,14 +1234,67 @@
         </w:drawing>
       </w:r>
     </w:p>
-    <w:p>
-      <w:r>
-        <w:lastRenderedPageBreak/>
+    <w:p/>
+    <w:p>
+      <w:r>
+        <w:t xml:space="preserve">7) </w:t>
+      </w:r>
+      <w:r>
+        <w:t>Configuration of Management VLAN and Remote Access (SSH/Telnet)</w:t>
+      </w:r>
+      <w:r>
+        <w:t xml:space="preserve"> :</w:t>
+      </w:r>
+    </w:p>
+    <w:p>
+      <w:r>
+        <w:t>A management VLAN is a VLAN used specifically for managing a network device (like a switch) remotely. Instead of configuring the switch only through the console, we assign an IP address to a VLAN interface so that we can access the switch over the network using SSH or Telnet.</w:t>
+      </w:r>
+    </w:p>
+    <w:p>
+      <w:pPr>
+        <w:numPr>
+          <w:ilvl w:val="0"/>
+          <w:numId w:val="7"/>
+        </w:numPr>
+      </w:pPr>
+      <w:r>
+        <w:t>Management VLAN = VLAN used for remote administration</w:t>
+      </w:r>
+    </w:p>
+    <w:p>
+      <w:pPr>
+        <w:numPr>
+          <w:ilvl w:val="0"/>
+          <w:numId w:val="7"/>
+        </w:numPr>
+      </w:pPr>
+      <w:r>
+        <w:t>IP address is assigned to a virtual interface called SVI (Switch Virtual Interface)</w:t>
+      </w:r>
+    </w:p>
+    <w:p>
+      <w:pPr>
+        <w:numPr>
+          <w:ilvl w:val="0"/>
+          <w:numId w:val="7"/>
+        </w:numPr>
+      </w:pPr>
+      <w:r>
+        <w:t>Remote access is done using SSH (secure) or Telnet (not secure)</w:t>
+      </w:r>
+    </w:p>
+    <w:p/>
+    <w:p>
+      <w:r>
+        <w:rPr>
+          <w:noProof/>
+        </w:rPr>
         <w:drawing>
-          <wp:inline distT="0" distB="0" distL="0" distR="0" wp14:anchorId="1C351E91" wp14:editId="467AE875">
+          <wp:inline distT="0" distB="0" distL="0" distR="0" wp14:anchorId="7B9F838F" wp14:editId="612C97B3">
             <wp:extent cx="5731510" cy="6042025"/>
             <wp:effectExtent l="0" t="0" r="2540" b="0"/>
-            <wp:docPr id="176250438" name="Picture 1"/>
+            <wp:docPr id="395013389" name="Picture 1"/>
             <wp:cNvGraphicFramePr>
               <a:graphicFrameLocks xmlns:a="http://schemas.openxmlformats.org/drawingml/2006/main" noChangeAspect="1"/>
             </wp:cNvGraphicFramePr>
@@ -1098,7 +1302,7 @@
               <a:graphicData uri="http://schemas.openxmlformats.org/drawingml/2006/picture">
                 <pic:pic xmlns:pic="http://schemas.openxmlformats.org/drawingml/2006/picture">
                   <pic:nvPicPr>
-                    <pic:cNvPr id="176250438" name=""/>
+                    <pic:cNvPr id="395013389" name=""/>
                     <pic:cNvPicPr/>
                   </pic:nvPicPr>
                   <pic:blipFill>
@@ -1123,8 +1327,143 @@
         </w:drawing>
       </w:r>
     </w:p>
-    <w:p>
-      <w:r>
+    <w:p/>
+    <w:p/>
+    <w:p/>
+    <w:p>
+      <w:r>
+        <w:rPr>
+          <w:noProof/>
+        </w:rPr>
+        <w:lastRenderedPageBreak/>
+        <w:drawing>
+          <wp:inline distT="0" distB="0" distL="0" distR="0" wp14:anchorId="76780628" wp14:editId="06D47D82">
+            <wp:extent cx="5731510" cy="6042025"/>
+            <wp:effectExtent l="0" t="0" r="2540" b="0"/>
+            <wp:docPr id="354082208" name="Picture 1"/>
+            <wp:cNvGraphicFramePr>
+              <a:graphicFrameLocks xmlns:a="http://schemas.openxmlformats.org/drawingml/2006/main" noChangeAspect="1"/>
+            </wp:cNvGraphicFramePr>
+            <a:graphic xmlns:a="http://schemas.openxmlformats.org/drawingml/2006/main">
+              <a:graphicData uri="http://schemas.openxmlformats.org/drawingml/2006/picture">
+                <pic:pic xmlns:pic="http://schemas.openxmlformats.org/drawingml/2006/picture">
+                  <pic:nvPicPr>
+                    <pic:cNvPr id="354082208" name=""/>
+                    <pic:cNvPicPr/>
+                  </pic:nvPicPr>
+                  <pic:blipFill>
+                    <a:blip r:embed="rId25"/>
+                    <a:stretch>
+                      <a:fillRect/>
+                    </a:stretch>
+                  </pic:blipFill>
+                  <pic:spPr>
+                    <a:xfrm>
+                      <a:off x="0" y="0"/>
+                      <a:ext cx="5731510" cy="6042025"/>
+                    </a:xfrm>
+                    <a:prstGeom prst="rect">
+                      <a:avLst/>
+                    </a:prstGeom>
+                  </pic:spPr>
+                </pic:pic>
+              </a:graphicData>
+            </a:graphic>
+          </wp:inline>
+        </w:drawing>
+      </w:r>
+    </w:p>
+    <w:p>
+      <w:r>
+        <w:rPr>
+          <w:noProof/>
+        </w:rPr>
+        <w:lastRenderedPageBreak/>
+        <w:drawing>
+          <wp:inline distT="0" distB="0" distL="0" distR="0" wp14:anchorId="22F93603" wp14:editId="27317A22">
+            <wp:extent cx="5731510" cy="6042025"/>
+            <wp:effectExtent l="0" t="0" r="2540" b="0"/>
+            <wp:docPr id="7901690" name="Picture 1"/>
+            <wp:cNvGraphicFramePr>
+              <a:graphicFrameLocks xmlns:a="http://schemas.openxmlformats.org/drawingml/2006/main" noChangeAspect="1"/>
+            </wp:cNvGraphicFramePr>
+            <a:graphic xmlns:a="http://schemas.openxmlformats.org/drawingml/2006/main">
+              <a:graphicData uri="http://schemas.openxmlformats.org/drawingml/2006/picture">
+                <pic:pic xmlns:pic="http://schemas.openxmlformats.org/drawingml/2006/picture">
+                  <pic:nvPicPr>
+                    <pic:cNvPr id="7901690" name=""/>
+                    <pic:cNvPicPr/>
+                  </pic:nvPicPr>
+                  <pic:blipFill>
+                    <a:blip r:embed="rId26"/>
+                    <a:stretch>
+                      <a:fillRect/>
+                    </a:stretch>
+                  </pic:blipFill>
+                  <pic:spPr>
+                    <a:xfrm>
+                      <a:off x="0" y="0"/>
+                      <a:ext cx="5731510" cy="6042025"/>
+                    </a:xfrm>
+                    <a:prstGeom prst="rect">
+                      <a:avLst/>
+                    </a:prstGeom>
+                  </pic:spPr>
+                </pic:pic>
+              </a:graphicData>
+            </a:graphic>
+          </wp:inline>
+        </w:drawing>
+      </w:r>
+    </w:p>
+    <w:p>
+      <w:r>
+        <w:rPr>
+          <w:noProof/>
+        </w:rPr>
+        <w:lastRenderedPageBreak/>
+        <w:drawing>
+          <wp:inline distT="0" distB="0" distL="0" distR="0" wp14:anchorId="1C351E91" wp14:editId="467AE875">
+            <wp:extent cx="5731510" cy="6042025"/>
+            <wp:effectExtent l="0" t="0" r="2540" b="0"/>
+            <wp:docPr id="176250438" name="Picture 1"/>
+            <wp:cNvGraphicFramePr>
+              <a:graphicFrameLocks xmlns:a="http://schemas.openxmlformats.org/drawingml/2006/main" noChangeAspect="1"/>
+            </wp:cNvGraphicFramePr>
+            <a:graphic xmlns:a="http://schemas.openxmlformats.org/drawingml/2006/main">
+              <a:graphicData uri="http://schemas.openxmlformats.org/drawingml/2006/picture">
+                <pic:pic xmlns:pic="http://schemas.openxmlformats.org/drawingml/2006/picture">
+                  <pic:nvPicPr>
+                    <pic:cNvPr id="176250438" name=""/>
+                    <pic:cNvPicPr/>
+                  </pic:nvPicPr>
+                  <pic:blipFill>
+                    <a:blip r:embed="rId27"/>
+                    <a:stretch>
+                      <a:fillRect/>
+                    </a:stretch>
+                  </pic:blipFill>
+                  <pic:spPr>
+                    <a:xfrm>
+                      <a:off x="0" y="0"/>
+                      <a:ext cx="5731510" cy="6042025"/>
+                    </a:xfrm>
+                    <a:prstGeom prst="rect">
+                      <a:avLst/>
+                    </a:prstGeom>
+                  </pic:spPr>
+                </pic:pic>
+              </a:graphicData>
+            </a:graphic>
+          </wp:inline>
+        </w:drawing>
+      </w:r>
+    </w:p>
+    <w:p>
+      <w:r>
+        <w:rPr>
+          <w:noProof/>
+        </w:rPr>
         <w:lastRenderedPageBreak/>
         <w:drawing>
           <wp:inline distT="0" distB="0" distL="0" distR="0" wp14:anchorId="60B0C66C" wp14:editId="08A9E3E4">
@@ -1142,7 +1481,7 @@
                     <pic:cNvPicPr/>
                   </pic:nvPicPr>
                   <pic:blipFill>
-                    <a:blip r:embed="rId25"/>
+                    <a:blip r:embed="rId28"/>
                     <a:stretch>
                       <a:fillRect/>
                     </a:stretch>
@@ -1165,11 +1504,13 @@
     </w:p>
     <w:p>
       <w:r>
-        <w:lastRenderedPageBreak/>
+        <w:rPr>
+          <w:noProof/>
+        </w:rPr>
         <w:drawing>
-          <wp:inline distT="0" distB="0" distL="0" distR="0" wp14:anchorId="04E8BB14" wp14:editId="6F5D930E">
-            <wp:extent cx="4639322" cy="5525271"/>
-            <wp:effectExtent l="0" t="0" r="8890" b="0"/>
+          <wp:inline distT="0" distB="0" distL="0" distR="0" wp14:anchorId="04E8BB14" wp14:editId="3FD31829">
+            <wp:extent cx="4858290" cy="4880449"/>
+            <wp:effectExtent l="0" t="0" r="0" b="0"/>
             <wp:docPr id="67882296" name="Picture 1"/>
             <wp:cNvGraphicFramePr>
               <a:graphicFrameLocks xmlns:a="http://schemas.openxmlformats.org/drawingml/2006/main" noChangeAspect="1"/>
@@ -1182,7 +1523,7 @@
                     <pic:cNvPicPr/>
                   </pic:nvPicPr>
                   <pic:blipFill>
-                    <a:blip r:embed="rId26"/>
+                    <a:blip r:embed="rId29"/>
                     <a:stretch>
                       <a:fillRect/>
                     </a:stretch>
@@ -1190,7 +1531,7 @@
                   <pic:spPr>
                     <a:xfrm>
                       <a:off x="0" y="0"/>
-                      <a:ext cx="4639322" cy="5525271"/>
+                      <a:ext cx="4866336" cy="4888532"/>
                     </a:xfrm>
                     <a:prstGeom prst="rect">
                       <a:avLst/>
@@ -1205,6 +1546,9 @@
     </w:p>
     <w:p>
       <w:r>
+        <w:rPr>
+          <w:noProof/>
+        </w:rPr>
         <w:lastRenderedPageBreak/>
         <w:drawing>
           <wp:inline distT="0" distB="0" distL="0" distR="0" wp14:anchorId="4F811BE9" wp14:editId="2718A252">
@@ -1219,424 +1563,6 @@
                 <pic:pic xmlns:pic="http://schemas.openxmlformats.org/drawingml/2006/picture">
                   <pic:nvPicPr>
                     <pic:cNvPr id="1037074806" name=""/>
-                    <pic:cNvPicPr/>
-                  </pic:nvPicPr>
-                  <pic:blipFill>
-                    <a:blip r:embed="rId27"/>
-                    <a:stretch>
-                      <a:fillRect/>
-                    </a:stretch>
-                  </pic:blipFill>
-                  <pic:spPr>
-                    <a:xfrm>
-                      <a:off x="0" y="0"/>
-                      <a:ext cx="4639322" cy="5525271"/>
-                    </a:xfrm>
-                    <a:prstGeom prst="rect">
-                      <a:avLst/>
-                    </a:prstGeom>
-                  </pic:spPr>
-                </pic:pic>
-              </a:graphicData>
-            </a:graphic>
-          </wp:inline>
-        </w:drawing>
-      </w:r>
-    </w:p>
-    <w:p/>
-    <w:p/>
-    <w:p/>
-    <w:p/>
-    <w:p/>
-    <w:p/>
-    <w:p/>
-    <w:p/>
-    <w:p/>
-    <w:p/>
-    <w:p/>
-    <w:p/>
-    <w:p/>
-    <w:p/>
-    <w:p/>
-    <w:p/>
-    <w:p/>
-    <w:p/>
-    <w:p/>
-    <w:p/>
-    <w:p/>
-    <w:p/>
-    <w:p/>
-    <w:p/>
-    <w:p/>
-    <w:p/>
-    <w:p/>
-    <w:p/>
-    <w:p/>
-    <w:p/>
-    <w:p/>
-    <w:p/>
-    <w:p>
-      <w:pPr>
-        <w:rPr>
-          <w:b/>
-          <w:bCs/>
-        </w:rPr>
-      </w:pPr>
-      <w:r>
-        <w:t>10)</w:t>
-      </w:r>
-      <w:r>
-        <w:rPr>
-          <w:rFonts w:ascii="Segoe UI" w:eastAsia="Times New Roman" w:hAnsi="Segoe UI" w:cs="Segoe UI"/>
-          <w:b/>
-          <w:bCs/>
-          <w:color w:val="1F2328"/>
-          <w:kern w:val="0"/>
-          <w:sz w:val="30"/>
-          <w:szCs w:val="30"/>
-          <w:lang w:eastAsia="en-IN"/>
-          <w14:ligatures w14:val="none"/>
-        </w:rPr>
-        <w:t xml:space="preserve"> </w:t>
-      </w:r>
-      <w:r>
-        <w:rPr>
-          <w:rFonts w:ascii="Segoe UI" w:eastAsia="Times New Roman" w:hAnsi="Segoe UI" w:cs="Segoe UI"/>
-          <w:b/>
-          <w:bCs/>
-          <w:color w:val="1F2328"/>
-          <w:kern w:val="0"/>
-          <w:sz w:val="30"/>
-          <w:szCs w:val="30"/>
-          <w:lang w:eastAsia="en-IN"/>
-          <w14:ligatures w14:val="none"/>
-        </w:rPr>
-        <w:t>T</w:t>
-      </w:r>
-      <w:r>
-        <w:rPr>
-          <w:b/>
-          <w:bCs/>
-        </w:rPr>
-        <w:t>roubleshooting VLAN 10 and VLAN 20 Communication Issue</w:t>
-      </w:r>
-    </w:p>
-    <w:p>
-      <w:r>
-        <w:t>Devices in VLAN 10 are unable to communicate with devices in VLAN 20 because VLANs operate as </w:t>
-      </w:r>
-      <w:r>
-        <w:rPr>
-          <w:b/>
-          <w:bCs/>
-        </w:rPr>
-        <w:t>separate Layer 2 broadcast domains</w:t>
-      </w:r>
-      <w:r>
-        <w:t>. A standard Layer 2 switch (like Cisco 2960) can forward traffic within the same VLAN but </w:t>
-      </w:r>
-      <w:r>
-        <w:rPr>
-          <w:b/>
-          <w:bCs/>
-        </w:rPr>
-        <w:t>cannot route traffic between different VLANs</w:t>
-      </w:r>
-      <w:r>
-        <w:t>.</w:t>
-      </w:r>
-    </w:p>
-    <w:p>
-      <w:pPr>
-        <w:rPr>
-          <w:b/>
-          <w:bCs/>
-        </w:rPr>
-      </w:pPr>
-      <w:r>
-        <w:rPr>
-          <w:b/>
-          <w:bCs/>
-        </w:rPr>
-        <w:t>Root Cause:</w:t>
-      </w:r>
-    </w:p>
-    <w:p>
-      <w:pPr>
-        <w:numPr>
-          <w:ilvl w:val="0"/>
-          <w:numId w:val="5"/>
-        </w:numPr>
-      </w:pPr>
-      <w:r>
-        <w:t>VLAN 10 and VLAN 20 are logically isolated.</w:t>
-      </w:r>
-    </w:p>
-    <w:p>
-      <w:pPr>
-        <w:numPr>
-          <w:ilvl w:val="0"/>
-          <w:numId w:val="5"/>
-        </w:numPr>
-      </w:pPr>
-      <w:r>
-        <w:lastRenderedPageBreak/>
-        <w:t>No </w:t>
-      </w:r>
-      <w:r>
-        <w:rPr>
-          <w:b/>
-          <w:bCs/>
-        </w:rPr>
-        <w:t>Layer 3 device</w:t>
-      </w:r>
-      <w:r>
-        <w:t> is present to perform routing between VLANs.</w:t>
-      </w:r>
-    </w:p>
-    <w:p>
-      <w:pPr>
-        <w:numPr>
-          <w:ilvl w:val="0"/>
-          <w:numId w:val="5"/>
-        </w:numPr>
-      </w:pPr>
-      <w:r>
-        <w:t>Hence, packets cannot move from one VLAN to another.</w:t>
-      </w:r>
-    </w:p>
-    <w:p>
-      <w:pPr>
-        <w:rPr>
-          <w:b/>
-          <w:bCs/>
-        </w:rPr>
-      </w:pPr>
-      <w:r>
-        <w:rPr>
-          <w:b/>
-          <w:bCs/>
-        </w:rPr>
-        <w:t>Solution (Inter-VLAN Routing):</w:t>
-      </w:r>
-    </w:p>
-    <w:p>
-      <w:r>
-        <w:t>To enable communication, configure </w:t>
-      </w:r>
-      <w:r>
-        <w:rPr>
-          <w:b/>
-          <w:bCs/>
-        </w:rPr>
-        <w:t>Router-on-a-Stick</w:t>
-      </w:r>
-      <w:r>
-        <w:t>:</w:t>
-      </w:r>
-    </w:p>
-    <w:p>
-      <w:pPr>
-        <w:numPr>
-          <w:ilvl w:val="0"/>
-          <w:numId w:val="6"/>
-        </w:numPr>
-      </w:pPr>
-      <w:r>
-        <w:t>Connect the switch to a router.</w:t>
-      </w:r>
-    </w:p>
-    <w:p>
-      <w:pPr>
-        <w:numPr>
-          <w:ilvl w:val="0"/>
-          <w:numId w:val="6"/>
-        </w:numPr>
-      </w:pPr>
-      <w:r>
-        <w:t>Configure the switch port connected to the router as a </w:t>
-      </w:r>
-      <w:r>
-        <w:rPr>
-          <w:b/>
-          <w:bCs/>
-        </w:rPr>
-        <w:t>trunk port</w:t>
-      </w:r>
-      <w:r>
-        <w:t>.</w:t>
-      </w:r>
-    </w:p>
-    <w:p>
-      <w:pPr>
-        <w:numPr>
-          <w:ilvl w:val="0"/>
-          <w:numId w:val="6"/>
-        </w:numPr>
-      </w:pPr>
-      <w:r>
-        <w:t>On the router, create </w:t>
-      </w:r>
-      <w:r>
-        <w:rPr>
-          <w:b/>
-          <w:bCs/>
-        </w:rPr>
-        <w:t>subinterfaces</w:t>
-      </w:r>
-      <w:r>
-        <w:t> for each VLAN:</w:t>
-      </w:r>
-    </w:p>
-    <w:p>
-      <w:pPr>
-        <w:numPr>
-          <w:ilvl w:val="1"/>
-          <w:numId w:val="6"/>
-        </w:numPr>
-      </w:pPr>
-      <w:r>
-        <w:t>One for VLAN 10</w:t>
-      </w:r>
-    </w:p>
-    <w:p>
-      <w:pPr>
-        <w:numPr>
-          <w:ilvl w:val="1"/>
-          <w:numId w:val="6"/>
-        </w:numPr>
-      </w:pPr>
-      <w:r>
-        <w:t>One for VLAN 20</w:t>
-      </w:r>
-    </w:p>
-    <w:p>
-      <w:pPr>
-        <w:numPr>
-          <w:ilvl w:val="0"/>
-          <w:numId w:val="6"/>
-        </w:numPr>
-      </w:pPr>
-      <w:r>
-        <w:t>Assign IP addresses to each subinterface (these act as </w:t>
-      </w:r>
-      <w:r>
-        <w:rPr>
-          <w:b/>
-          <w:bCs/>
-        </w:rPr>
-        <w:t>default gateways</w:t>
-      </w:r>
-      <w:r>
-        <w:t>).</w:t>
-      </w:r>
-    </w:p>
-    <w:p>
-      <w:pPr>
-        <w:numPr>
-          <w:ilvl w:val="0"/>
-          <w:numId w:val="6"/>
-        </w:numPr>
-      </w:pPr>
-      <w:r>
-        <w:t>Ensure devices in each VLAN use the correct gateway IP.</w:t>
-      </w:r>
-    </w:p>
-    <w:p>
-      <w:r>
-        <w:drawing>
-          <wp:inline distT="0" distB="0" distL="0" distR="0" wp14:anchorId="711D1F7A" wp14:editId="5C14FA66">
-            <wp:extent cx="4594352" cy="4843259"/>
-            <wp:effectExtent l="0" t="0" r="0" b="0"/>
-            <wp:docPr id="954973143" name="Picture 1"/>
-            <wp:cNvGraphicFramePr>
-              <a:graphicFrameLocks xmlns:a="http://schemas.openxmlformats.org/drawingml/2006/main" noChangeAspect="1"/>
-            </wp:cNvGraphicFramePr>
-            <a:graphic xmlns:a="http://schemas.openxmlformats.org/drawingml/2006/main">
-              <a:graphicData uri="http://schemas.openxmlformats.org/drawingml/2006/picture">
-                <pic:pic xmlns:pic="http://schemas.openxmlformats.org/drawingml/2006/picture">
-                  <pic:nvPicPr>
-                    <pic:cNvPr id="954973143" name=""/>
-                    <pic:cNvPicPr/>
-                  </pic:nvPicPr>
-                  <pic:blipFill>
-                    <a:blip r:embed="rId28"/>
-                    <a:stretch>
-                      <a:fillRect/>
-                    </a:stretch>
-                  </pic:blipFill>
-                  <pic:spPr>
-                    <a:xfrm>
-                      <a:off x="0" y="0"/>
-                      <a:ext cx="4610785" cy="4860583"/>
-                    </a:xfrm>
-                    <a:prstGeom prst="rect">
-                      <a:avLst/>
-                    </a:prstGeom>
-                  </pic:spPr>
-                </pic:pic>
-              </a:graphicData>
-            </a:graphic>
-          </wp:inline>
-        </w:drawing>
-      </w:r>
-    </w:p>
-    <w:p>
-      <w:r>
-        <w:lastRenderedPageBreak/>
-        <w:drawing>
-          <wp:inline distT="0" distB="0" distL="0" distR="0" wp14:anchorId="79CEA222" wp14:editId="072EEA51">
-            <wp:extent cx="4639322" cy="5525271"/>
-            <wp:effectExtent l="0" t="0" r="8890" b="0"/>
-            <wp:docPr id="1234791822" name="Picture 1"/>
-            <wp:cNvGraphicFramePr>
-              <a:graphicFrameLocks xmlns:a="http://schemas.openxmlformats.org/drawingml/2006/main" noChangeAspect="1"/>
-            </wp:cNvGraphicFramePr>
-            <a:graphic xmlns:a="http://schemas.openxmlformats.org/drawingml/2006/main">
-              <a:graphicData uri="http://schemas.openxmlformats.org/drawingml/2006/picture">
-                <pic:pic xmlns:pic="http://schemas.openxmlformats.org/drawingml/2006/picture">
-                  <pic:nvPicPr>
-                    <pic:cNvPr id="1234791822" name=""/>
-                    <pic:cNvPicPr/>
-                  </pic:nvPicPr>
-                  <pic:blipFill>
-                    <a:blip r:embed="rId29"/>
-                    <a:stretch>
-                      <a:fillRect/>
-                    </a:stretch>
-                  </pic:blipFill>
-                  <pic:spPr>
-                    <a:xfrm>
-                      <a:off x="0" y="0"/>
-                      <a:ext cx="4639322" cy="5525271"/>
-                    </a:xfrm>
-                    <a:prstGeom prst="rect">
-                      <a:avLst/>
-                    </a:prstGeom>
-                  </pic:spPr>
-                </pic:pic>
-              </a:graphicData>
-            </a:graphic>
-          </wp:inline>
-        </w:drawing>
-      </w:r>
-    </w:p>
-    <w:p>
-      <w:r>
-        <w:lastRenderedPageBreak/>
-        <w:drawing>
-          <wp:inline distT="0" distB="0" distL="0" distR="0" wp14:anchorId="38FEB053" wp14:editId="1DBF2936">
-            <wp:extent cx="4639322" cy="5525271"/>
-            <wp:effectExtent l="0" t="0" r="8890" b="0"/>
-            <wp:docPr id="1423331322" name="Picture 1"/>
-            <wp:cNvGraphicFramePr>
-              <a:graphicFrameLocks xmlns:a="http://schemas.openxmlformats.org/drawingml/2006/main" noChangeAspect="1"/>
-            </wp:cNvGraphicFramePr>
-            <a:graphic xmlns:a="http://schemas.openxmlformats.org/drawingml/2006/main">
-              <a:graphicData uri="http://schemas.openxmlformats.org/drawingml/2006/picture">
-                <pic:pic xmlns:pic="http://schemas.openxmlformats.org/drawingml/2006/picture">
-                  <pic:nvPicPr>
-                    <pic:cNvPr id="1423331322" name=""/>
                     <pic:cNvPicPr/>
                   </pic:nvPicPr>
                   <pic:blipFill>
@@ -1663,19 +1589,2664 @@
     </w:p>
     <w:p/>
     <w:p>
-      <w:r>
-        <w:t>ss</w:t>
+      <w:pPr>
+        <w:rPr>
+          <w:b/>
+          <w:bCs/>
+        </w:rPr>
+      </w:pPr>
+      <w:r>
+        <w:t>10)</w:t>
+      </w:r>
+      <w:r>
+        <w:rPr>
+          <w:rFonts w:ascii="Segoe UI" w:eastAsia="Times New Roman" w:hAnsi="Segoe UI" w:cs="Segoe UI"/>
+          <w:b/>
+          <w:bCs/>
+          <w:color w:val="1F2328"/>
+          <w:kern w:val="0"/>
+          <w:sz w:val="30"/>
+          <w:szCs w:val="30"/>
+          <w:lang w:eastAsia="en-IN"/>
+          <w14:ligatures w14:val="none"/>
+        </w:rPr>
+        <w:t xml:space="preserve"> </w:t>
+      </w:r>
+      <w:r>
+        <w:rPr>
+          <w:rFonts w:ascii="Segoe UI" w:eastAsia="Times New Roman" w:hAnsi="Segoe UI" w:cs="Segoe UI"/>
+          <w:b/>
+          <w:bCs/>
+          <w:color w:val="1F2328"/>
+          <w:kern w:val="0"/>
+          <w:sz w:val="30"/>
+          <w:szCs w:val="30"/>
+          <w:lang w:eastAsia="en-IN"/>
+          <w14:ligatures w14:val="none"/>
+        </w:rPr>
+        <w:t>T</w:t>
+      </w:r>
+      <w:r>
+        <w:rPr>
+          <w:b/>
+          <w:bCs/>
+        </w:rPr>
+        <w:t>roubleshooting VLAN 10 and VLAN 20 Communication Issue</w:t>
+      </w:r>
+    </w:p>
+    <w:p>
+      <w:pPr>
+        <w:rPr>
+          <w:b/>
+          <w:bCs/>
+        </w:rPr>
+      </w:pPr>
+      <w:r>
+        <w:t>Devices in VLAN 10 are unable to communicate with devices in VLAN 20 because VLANs operate as </w:t>
+      </w:r>
+      <w:r>
+        <w:rPr>
+          <w:b/>
+          <w:bCs/>
+        </w:rPr>
+        <w:t>separate Layer 2 broadcast domains</w:t>
+      </w:r>
+      <w:r>
+        <w:t>. A standard Layer 2 switch (like Cisco 2960) can forward traffic within the same VLAN but </w:t>
+      </w:r>
+      <w:r>
+        <w:rPr>
+          <w:b/>
+          <w:bCs/>
+        </w:rPr>
+        <w:t>cannot route traffic between different VLANs</w:t>
+      </w:r>
+      <w:r>
+        <w:t>.</w:t>
+      </w:r>
+    </w:p>
+    <w:p>
+      <w:pPr>
+        <w:rPr>
+          <w:b/>
+          <w:bCs/>
+        </w:rPr>
+      </w:pPr>
+      <w:r>
+        <w:rPr>
+          <w:b/>
+          <w:bCs/>
+        </w:rPr>
+        <w:t>Root Cause:</w:t>
+      </w:r>
+    </w:p>
+    <w:p>
+      <w:pPr>
+        <w:numPr>
+          <w:ilvl w:val="0"/>
+          <w:numId w:val="5"/>
+        </w:numPr>
+      </w:pPr>
+      <w:r>
+        <w:t>VLAN 10 and VLAN 20 are logically isolated.</w:t>
+      </w:r>
+    </w:p>
+    <w:p>
+      <w:pPr>
+        <w:numPr>
+          <w:ilvl w:val="0"/>
+          <w:numId w:val="5"/>
+        </w:numPr>
+      </w:pPr>
+      <w:r>
+        <w:t>No </w:t>
+      </w:r>
+      <w:r>
+        <w:rPr>
+          <w:b/>
+          <w:bCs/>
+        </w:rPr>
+        <w:t>Layer 3 device</w:t>
+      </w:r>
+      <w:r>
+        <w:t> is present to perform routing between VLANs.</w:t>
+      </w:r>
+    </w:p>
+    <w:p>
+      <w:pPr>
+        <w:numPr>
+          <w:ilvl w:val="0"/>
+          <w:numId w:val="5"/>
+        </w:numPr>
+      </w:pPr>
+      <w:r>
+        <w:t>Hence, packets cannot move from one VLAN to another.</w:t>
+      </w:r>
+    </w:p>
+    <w:p>
+      <w:pPr>
+        <w:rPr>
+          <w:b/>
+          <w:bCs/>
+        </w:rPr>
+      </w:pPr>
+      <w:r>
+        <w:rPr>
+          <w:b/>
+          <w:bCs/>
+        </w:rPr>
+        <w:t>Solution (Inter-VLAN Routing):</w:t>
+      </w:r>
+    </w:p>
+    <w:p>
+      <w:r>
+        <w:lastRenderedPageBreak/>
+        <w:t>To enable communication, configure </w:t>
+      </w:r>
+      <w:r>
+        <w:rPr>
+          <w:b/>
+          <w:bCs/>
+        </w:rPr>
+        <w:t>Router-on-a-Stick</w:t>
+      </w:r>
+      <w:r>
+        <w:t>:</w:t>
+      </w:r>
+    </w:p>
+    <w:p>
+      <w:pPr>
+        <w:numPr>
+          <w:ilvl w:val="0"/>
+          <w:numId w:val="6"/>
+        </w:numPr>
+      </w:pPr>
+      <w:r>
+        <w:t>Connect the switch to a router.</w:t>
+      </w:r>
+    </w:p>
+    <w:p>
+      <w:pPr>
+        <w:numPr>
+          <w:ilvl w:val="0"/>
+          <w:numId w:val="6"/>
+        </w:numPr>
+      </w:pPr>
+      <w:r>
+        <w:t>Configure the switch port connected to the router as a </w:t>
+      </w:r>
+      <w:r>
+        <w:rPr>
+          <w:b/>
+          <w:bCs/>
+        </w:rPr>
+        <w:t>trunk port</w:t>
+      </w:r>
+      <w:r>
+        <w:t>.</w:t>
+      </w:r>
+    </w:p>
+    <w:p>
+      <w:pPr>
+        <w:numPr>
+          <w:ilvl w:val="0"/>
+          <w:numId w:val="6"/>
+        </w:numPr>
+      </w:pPr>
+      <w:r>
+        <w:t>On the router, create </w:t>
+      </w:r>
+      <w:proofErr w:type="spellStart"/>
+      <w:r>
+        <w:rPr>
+          <w:b/>
+          <w:bCs/>
+        </w:rPr>
+        <w:t>subinterfaces</w:t>
+      </w:r>
+      <w:proofErr w:type="spellEnd"/>
+      <w:r>
+        <w:t> for each VLAN:</w:t>
+      </w:r>
+    </w:p>
+    <w:p>
+      <w:pPr>
+        <w:numPr>
+          <w:ilvl w:val="1"/>
+          <w:numId w:val="6"/>
+        </w:numPr>
+      </w:pPr>
+      <w:r>
+        <w:t>One for VLAN 10</w:t>
+      </w:r>
+    </w:p>
+    <w:p>
+      <w:pPr>
+        <w:numPr>
+          <w:ilvl w:val="1"/>
+          <w:numId w:val="6"/>
+        </w:numPr>
+      </w:pPr>
+      <w:r>
+        <w:t>One for VLAN 20</w:t>
+      </w:r>
+    </w:p>
+    <w:p>
+      <w:pPr>
+        <w:numPr>
+          <w:ilvl w:val="0"/>
+          <w:numId w:val="6"/>
+        </w:numPr>
+      </w:pPr>
+      <w:r>
+        <w:t xml:space="preserve">Assign IP addresses to each </w:t>
+      </w:r>
+      <w:proofErr w:type="spellStart"/>
+      <w:r>
+        <w:t>subinterface</w:t>
+      </w:r>
+      <w:proofErr w:type="spellEnd"/>
+      <w:r>
+        <w:t xml:space="preserve"> (these act as </w:t>
+      </w:r>
+      <w:r>
+        <w:rPr>
+          <w:b/>
+          <w:bCs/>
+        </w:rPr>
+        <w:t>default gateways</w:t>
+      </w:r>
+      <w:r>
+        <w:t>).</w:t>
+      </w:r>
+    </w:p>
+    <w:p>
+      <w:pPr>
+        <w:numPr>
+          <w:ilvl w:val="0"/>
+          <w:numId w:val="6"/>
+        </w:numPr>
+      </w:pPr>
+      <w:r>
+        <w:t>Ensure devices in each VLAN use the correct gateway IP.</w:t>
+      </w:r>
+    </w:p>
+    <w:p>
+      <w:r>
+        <w:rPr>
+          <w:noProof/>
+        </w:rPr>
+        <w:drawing>
+          <wp:inline distT="0" distB="0" distL="0" distR="0" wp14:anchorId="711D1F7A" wp14:editId="5C14FA66">
+            <wp:extent cx="4594352" cy="4843259"/>
+            <wp:effectExtent l="0" t="0" r="0" b="0"/>
+            <wp:docPr id="954973143" name="Picture 1"/>
+            <wp:cNvGraphicFramePr>
+              <a:graphicFrameLocks xmlns:a="http://schemas.openxmlformats.org/drawingml/2006/main" noChangeAspect="1"/>
+            </wp:cNvGraphicFramePr>
+            <a:graphic xmlns:a="http://schemas.openxmlformats.org/drawingml/2006/main">
+              <a:graphicData uri="http://schemas.openxmlformats.org/drawingml/2006/picture">
+                <pic:pic xmlns:pic="http://schemas.openxmlformats.org/drawingml/2006/picture">
+                  <pic:nvPicPr>
+                    <pic:cNvPr id="954973143" name=""/>
+                    <pic:cNvPicPr/>
+                  </pic:nvPicPr>
+                  <pic:blipFill>
+                    <a:blip r:embed="rId31"/>
+                    <a:stretch>
+                      <a:fillRect/>
+                    </a:stretch>
+                  </pic:blipFill>
+                  <pic:spPr>
+                    <a:xfrm>
+                      <a:off x="0" y="0"/>
+                      <a:ext cx="4610785" cy="4860583"/>
+                    </a:xfrm>
+                    <a:prstGeom prst="rect">
+                      <a:avLst/>
+                    </a:prstGeom>
+                  </pic:spPr>
+                </pic:pic>
+              </a:graphicData>
+            </a:graphic>
+          </wp:inline>
+        </w:drawing>
+      </w:r>
+    </w:p>
+    <w:p>
+      <w:r>
+        <w:rPr>
+          <w:noProof/>
+        </w:rPr>
+        <w:lastRenderedPageBreak/>
+        <w:drawing>
+          <wp:inline distT="0" distB="0" distL="0" distR="0" wp14:anchorId="79CEA222" wp14:editId="072EEA51">
+            <wp:extent cx="4639322" cy="5525271"/>
+            <wp:effectExtent l="0" t="0" r="8890" b="0"/>
+            <wp:docPr id="1234791822" name="Picture 1"/>
+            <wp:cNvGraphicFramePr>
+              <a:graphicFrameLocks xmlns:a="http://schemas.openxmlformats.org/drawingml/2006/main" noChangeAspect="1"/>
+            </wp:cNvGraphicFramePr>
+            <a:graphic xmlns:a="http://schemas.openxmlformats.org/drawingml/2006/main">
+              <a:graphicData uri="http://schemas.openxmlformats.org/drawingml/2006/picture">
+                <pic:pic xmlns:pic="http://schemas.openxmlformats.org/drawingml/2006/picture">
+                  <pic:nvPicPr>
+                    <pic:cNvPr id="1234791822" name=""/>
+                    <pic:cNvPicPr/>
+                  </pic:nvPicPr>
+                  <pic:blipFill>
+                    <a:blip r:embed="rId32"/>
+                    <a:stretch>
+                      <a:fillRect/>
+                    </a:stretch>
+                  </pic:blipFill>
+                  <pic:spPr>
+                    <a:xfrm>
+                      <a:off x="0" y="0"/>
+                      <a:ext cx="4639322" cy="5525271"/>
+                    </a:xfrm>
+                    <a:prstGeom prst="rect">
+                      <a:avLst/>
+                    </a:prstGeom>
+                  </pic:spPr>
+                </pic:pic>
+              </a:graphicData>
+            </a:graphic>
+          </wp:inline>
+        </w:drawing>
+      </w:r>
+    </w:p>
+    <w:p>
+      <w:r>
+        <w:rPr>
+          <w:noProof/>
+        </w:rPr>
+        <w:lastRenderedPageBreak/>
+        <w:drawing>
+          <wp:inline distT="0" distB="0" distL="0" distR="0" wp14:anchorId="38FEB053" wp14:editId="1DBF2936">
+            <wp:extent cx="4639322" cy="5525271"/>
+            <wp:effectExtent l="0" t="0" r="8890" b="0"/>
+            <wp:docPr id="1423331322" name="Picture 1"/>
+            <wp:cNvGraphicFramePr>
+              <a:graphicFrameLocks xmlns:a="http://schemas.openxmlformats.org/drawingml/2006/main" noChangeAspect="1"/>
+            </wp:cNvGraphicFramePr>
+            <a:graphic xmlns:a="http://schemas.openxmlformats.org/drawingml/2006/main">
+              <a:graphicData uri="http://schemas.openxmlformats.org/drawingml/2006/picture">
+                <pic:pic xmlns:pic="http://schemas.openxmlformats.org/drawingml/2006/picture">
+                  <pic:nvPicPr>
+                    <pic:cNvPr id="1423331322" name=""/>
+                    <pic:cNvPicPr/>
+                  </pic:nvPicPr>
+                  <pic:blipFill>
+                    <a:blip r:embed="rId33"/>
+                    <a:stretch>
+                      <a:fillRect/>
+                    </a:stretch>
+                  </pic:blipFill>
+                  <pic:spPr>
+                    <a:xfrm>
+                      <a:off x="0" y="0"/>
+                      <a:ext cx="4639322" cy="5525271"/>
+                    </a:xfrm>
+                    <a:prstGeom prst="rect">
+                      <a:avLst/>
+                    </a:prstGeom>
+                  </pic:spPr>
+                </pic:pic>
+              </a:graphicData>
+            </a:graphic>
+          </wp:inline>
+        </w:drawing>
       </w:r>
     </w:p>
     <w:p/>
+    <w:p>
+      <w:pPr>
+        <w:rPr>
+          <w:b/>
+          <w:bCs/>
+        </w:rPr>
+      </w:pPr>
+      <w:r>
+        <w:rPr>
+          <w:b/>
+          <w:bCs/>
+        </w:rPr>
+        <w:t>11)</w:t>
+      </w:r>
+      <w:r>
+        <w:rPr>
+          <w:b/>
+          <w:bCs/>
+        </w:rPr>
+        <w:t xml:space="preserve"> ACL to restrict the traffic based on ports :</w:t>
+      </w:r>
+    </w:p>
+    <w:p>
+      <w:r>
+        <w:t>Access Control Lists (ACLs) are used in networking to control which traffic is allowed or denied across a network. In this lab, we will implement an extended ACL on a router to restrict traffic based on source and destination ports, and test the rules using HTTP and Telnet traffic between two PCs.</w:t>
+      </w:r>
+    </w:p>
     <w:p/>
-    <w:p/>
-    <w:p/>
-    <w:p/>
-    <w:p/>
-    <w:p/>
-    <w:p/>
-    <w:p/>
+    <w:p>
+      <w:r>
+        <w:lastRenderedPageBreak/>
+        <w:drawing>
+          <wp:inline distT="0" distB="0" distL="0" distR="0" wp14:anchorId="69BD79E4" wp14:editId="24FA1804">
+            <wp:extent cx="2133898" cy="1933845"/>
+            <wp:effectExtent l="0" t="0" r="0" b="9525"/>
+            <wp:docPr id="1844554264" name="Picture 1"/>
+            <wp:cNvGraphicFramePr>
+              <a:graphicFrameLocks xmlns:a="http://schemas.openxmlformats.org/drawingml/2006/main" noChangeAspect="1"/>
+            </wp:cNvGraphicFramePr>
+            <a:graphic xmlns:a="http://schemas.openxmlformats.org/drawingml/2006/main">
+              <a:graphicData uri="http://schemas.openxmlformats.org/drawingml/2006/picture">
+                <pic:pic xmlns:pic="http://schemas.openxmlformats.org/drawingml/2006/picture">
+                  <pic:nvPicPr>
+                    <pic:cNvPr id="1844554264" name=""/>
+                    <pic:cNvPicPr/>
+                  </pic:nvPicPr>
+                  <pic:blipFill>
+                    <a:blip r:embed="rId34"/>
+                    <a:stretch>
+                      <a:fillRect/>
+                    </a:stretch>
+                  </pic:blipFill>
+                  <pic:spPr>
+                    <a:xfrm>
+                      <a:off x="0" y="0"/>
+                      <a:ext cx="2133898" cy="1933845"/>
+                    </a:xfrm>
+                    <a:prstGeom prst="rect">
+                      <a:avLst/>
+                    </a:prstGeom>
+                  </pic:spPr>
+                </pic:pic>
+              </a:graphicData>
+            </a:graphic>
+          </wp:inline>
+        </w:drawing>
+      </w:r>
+    </w:p>
+    <w:p>
+      <w:r>
+        <w:drawing>
+          <wp:inline distT="0" distB="0" distL="0" distR="0" wp14:anchorId="05C3481A" wp14:editId="2FB1AE44">
+            <wp:extent cx="4648849" cy="4105848"/>
+            <wp:effectExtent l="0" t="0" r="0" b="9525"/>
+            <wp:docPr id="421851308" name="Picture 1"/>
+            <wp:cNvGraphicFramePr>
+              <a:graphicFrameLocks xmlns:a="http://schemas.openxmlformats.org/drawingml/2006/main" noChangeAspect="1"/>
+            </wp:cNvGraphicFramePr>
+            <a:graphic xmlns:a="http://schemas.openxmlformats.org/drawingml/2006/main">
+              <a:graphicData uri="http://schemas.openxmlformats.org/drawingml/2006/picture">
+                <pic:pic xmlns:pic="http://schemas.openxmlformats.org/drawingml/2006/picture">
+                  <pic:nvPicPr>
+                    <pic:cNvPr id="421851308" name=""/>
+                    <pic:cNvPicPr/>
+                  </pic:nvPicPr>
+                  <pic:blipFill>
+                    <a:blip r:embed="rId35"/>
+                    <a:stretch>
+                      <a:fillRect/>
+                    </a:stretch>
+                  </pic:blipFill>
+                  <pic:spPr>
+                    <a:xfrm>
+                      <a:off x="0" y="0"/>
+                      <a:ext cx="4648849" cy="4105848"/>
+                    </a:xfrm>
+                    <a:prstGeom prst="rect">
+                      <a:avLst/>
+                    </a:prstGeom>
+                  </pic:spPr>
+                </pic:pic>
+              </a:graphicData>
+            </a:graphic>
+          </wp:inline>
+        </w:drawing>
+      </w:r>
+    </w:p>
+    <w:p>
+      <w:pPr>
+        <w:rPr>
+          <w:b/>
+          <w:bCs/>
+        </w:rPr>
+      </w:pPr>
+      <w:r>
+        <w:rPr>
+          <w:b/>
+          <w:bCs/>
+        </w:rPr>
+        <w:t>Configuring a Standard ACL on a Router</w:t>
+      </w:r>
+    </w:p>
+    <w:p>
+      <w:pPr>
+        <w:rPr>
+          <w:b/>
+          <w:bCs/>
+        </w:rPr>
+      </w:pPr>
+      <w:r>
+        <w:rPr>
+          <w:b/>
+          <w:bCs/>
+        </w:rPr>
+        <w:t>What is a Standard ACL?</w:t>
+      </w:r>
+    </w:p>
+    <w:p>
+      <w:r>
+        <w:t>A Standard Access Control List (ACL) is a set of rules configured on a router to control network traffic. It filters packets based only on the </w:t>
+      </w:r>
+      <w:r>
+        <w:rPr>
+          <w:b/>
+          <w:bCs/>
+        </w:rPr>
+        <w:t>source IP address</w:t>
+      </w:r>
+      <w:r>
+        <w:t> — it does not check the destination or protocol type.</w:t>
+      </w:r>
+    </w:p>
+    <w:p>
+      <w:r>
+        <w:t>Standard ACLs are numbered from </w:t>
+      </w:r>
+      <w:r>
+        <w:rPr>
+          <w:b/>
+          <w:bCs/>
+        </w:rPr>
+        <w:t>1 to 99</w:t>
+      </w:r>
+      <w:r>
+        <w:t>. Because they only look at the source IP, they should be placed as close to the destination as possible to avoid accidentally blocking traffic on other paths.</w:t>
+      </w:r>
+    </w:p>
+    <w:p>
+      <w:r>
+        <w:t>Every ACL has an </w:t>
+      </w:r>
+      <w:r>
+        <w:rPr>
+          <w:b/>
+          <w:bCs/>
+        </w:rPr>
+        <w:t>implicit deny</w:t>
+      </w:r>
+      <w:r>
+        <w:t> at the end, meaning any traffic that does not match a permit rule is automatically blocked.</w:t>
+      </w:r>
+    </w:p>
+    <w:p>
+      <w:pPr>
+        <w:pStyle w:val="NoSpacing"/>
+      </w:pPr>
+      <w:r>
+        <w:lastRenderedPageBreak/>
+        <w:t>enable</w:t>
+      </w:r>
+    </w:p>
+    <w:p>
+      <w:pPr>
+        <w:pStyle w:val="NoSpacing"/>
+      </w:pPr>
+      <w:r>
+        <w:t>configure terminal</w:t>
+      </w:r>
+    </w:p>
+    <w:p>
+      <w:pPr>
+        <w:pStyle w:val="NoSpacing"/>
+      </w:pPr>
+    </w:p>
+    <w:p>
+      <w:pPr>
+        <w:pStyle w:val="NoSpacing"/>
+      </w:pPr>
+      <w:r>
+        <w:t>! Configure interface connected to LAN</w:t>
+      </w:r>
+    </w:p>
+    <w:p>
+      <w:pPr>
+        <w:pStyle w:val="NoSpacing"/>
+      </w:pPr>
+      <w:r>
+        <w:t xml:space="preserve">interface </w:t>
+      </w:r>
+      <w:proofErr w:type="spellStart"/>
+      <w:r>
+        <w:t>fastethernet</w:t>
+      </w:r>
+      <w:proofErr w:type="spellEnd"/>
+      <w:r>
+        <w:t xml:space="preserve"> 0/0</w:t>
+      </w:r>
+    </w:p>
+    <w:p>
+      <w:pPr>
+        <w:pStyle w:val="NoSpacing"/>
+      </w:pPr>
+      <w:proofErr w:type="spellStart"/>
+      <w:r>
+        <w:t>ip</w:t>
+      </w:r>
+      <w:proofErr w:type="spellEnd"/>
+      <w:r>
+        <w:t xml:space="preserve"> address 192.168.1.1 255.255.255.0</w:t>
+      </w:r>
+    </w:p>
+    <w:p>
+      <w:pPr>
+        <w:pStyle w:val="NoSpacing"/>
+      </w:pPr>
+      <w:r>
+        <w:t>no shutdown</w:t>
+      </w:r>
+    </w:p>
+    <w:p>
+      <w:pPr>
+        <w:pStyle w:val="NoSpacing"/>
+      </w:pPr>
+      <w:r>
+        <w:t>exit</w:t>
+      </w:r>
+    </w:p>
+    <w:p>
+      <w:pPr>
+        <w:pStyle w:val="NoSpacing"/>
+      </w:pPr>
+    </w:p>
+    <w:p>
+      <w:pPr>
+        <w:pStyle w:val="NoSpacing"/>
+      </w:pPr>
+      <w:r>
+        <w:t>! Configure interface connected to Server network</w:t>
+      </w:r>
+    </w:p>
+    <w:p>
+      <w:pPr>
+        <w:pStyle w:val="NoSpacing"/>
+      </w:pPr>
+      <w:r>
+        <w:t xml:space="preserve">interface </w:t>
+      </w:r>
+      <w:proofErr w:type="spellStart"/>
+      <w:r>
+        <w:t>fastethernet</w:t>
+      </w:r>
+      <w:proofErr w:type="spellEnd"/>
+      <w:r>
+        <w:t xml:space="preserve"> 0/1</w:t>
+      </w:r>
+    </w:p>
+    <w:p>
+      <w:pPr>
+        <w:pStyle w:val="NoSpacing"/>
+      </w:pPr>
+      <w:proofErr w:type="spellStart"/>
+      <w:r>
+        <w:t>ip</w:t>
+      </w:r>
+      <w:proofErr w:type="spellEnd"/>
+      <w:r>
+        <w:t xml:space="preserve"> address 192.168.2.1 255.255.255.0</w:t>
+      </w:r>
+    </w:p>
+    <w:p>
+      <w:pPr>
+        <w:pStyle w:val="NoSpacing"/>
+      </w:pPr>
+      <w:r>
+        <w:t>no shutdown</w:t>
+      </w:r>
+    </w:p>
+    <w:p>
+      <w:pPr>
+        <w:pStyle w:val="NoSpacing"/>
+      </w:pPr>
+      <w:r>
+        <w:t>exit</w:t>
+      </w:r>
+    </w:p>
+    <w:p>
+      <w:pPr>
+        <w:pStyle w:val="NoSpacing"/>
+      </w:pPr>
+    </w:p>
+    <w:p>
+      <w:pPr>
+        <w:pStyle w:val="NoSpacing"/>
+      </w:pPr>
+      <w:r>
+        <w:t>! Create Standard ACL (permit only one host)</w:t>
+      </w:r>
+    </w:p>
+    <w:p>
+      <w:pPr>
+        <w:pStyle w:val="NoSpacing"/>
+      </w:pPr>
+      <w:r>
+        <w:t>access-list 10 permit host 192.168.1.10</w:t>
+      </w:r>
+    </w:p>
+    <w:p>
+      <w:pPr>
+        <w:pStyle w:val="NoSpacing"/>
+      </w:pPr>
+      <w:r>
+        <w:t>access-list 10 deny any</w:t>
+      </w:r>
+    </w:p>
+    <w:p>
+      <w:pPr>
+        <w:pStyle w:val="NoSpacing"/>
+      </w:pPr>
+    </w:p>
+    <w:p>
+      <w:pPr>
+        <w:pStyle w:val="NoSpacing"/>
+      </w:pPr>
+      <w:r>
+        <w:t>! Apply ACL to interface (outbound)</w:t>
+      </w:r>
+    </w:p>
+    <w:p>
+      <w:pPr>
+        <w:pStyle w:val="NoSpacing"/>
+      </w:pPr>
+      <w:r>
+        <w:t xml:space="preserve">interface </w:t>
+      </w:r>
+      <w:proofErr w:type="spellStart"/>
+      <w:r>
+        <w:t>fastethernet</w:t>
+      </w:r>
+      <w:proofErr w:type="spellEnd"/>
+      <w:r>
+        <w:t xml:space="preserve"> 0/1</w:t>
+      </w:r>
+    </w:p>
+    <w:p>
+      <w:pPr>
+        <w:pStyle w:val="NoSpacing"/>
+      </w:pPr>
+      <w:proofErr w:type="spellStart"/>
+      <w:r>
+        <w:t>ip</w:t>
+      </w:r>
+      <w:proofErr w:type="spellEnd"/>
+      <w:r>
+        <w:t xml:space="preserve"> access-group 10 out</w:t>
+      </w:r>
+    </w:p>
+    <w:p>
+      <w:pPr>
+        <w:pStyle w:val="NoSpacing"/>
+      </w:pPr>
+      <w:r>
+        <w:t>exit</w:t>
+      </w:r>
+    </w:p>
+    <w:p>
+      <w:pPr>
+        <w:pStyle w:val="NoSpacing"/>
+      </w:pPr>
+    </w:p>
+    <w:p>
+      <w:pPr>
+        <w:pStyle w:val="NoSpacing"/>
+      </w:pPr>
+      <w:r>
+        <w:t>end</w:t>
+      </w:r>
+    </w:p>
+    <w:p>
+      <w:pPr>
+        <w:pStyle w:val="NoSpacing"/>
+      </w:pPr>
+      <w:r>
+        <w:t>write memory</w:t>
+      </w:r>
+    </w:p>
+    <w:p>
+      <w:pPr>
+        <w:pStyle w:val="NoSpacing"/>
+      </w:pPr>
+    </w:p>
+    <w:p>
+      <w:pPr>
+        <w:pStyle w:val="NoSpacing"/>
+        <w:rPr>
+          <w:b/>
+          <w:bCs/>
+        </w:rPr>
+      </w:pPr>
+      <w:r>
+        <w:rPr>
+          <w:b/>
+          <w:bCs/>
+        </w:rPr>
+        <w:t>Testing Connectivity</w:t>
+      </w:r>
+    </w:p>
+    <w:p>
+      <w:pPr>
+        <w:pStyle w:val="NoSpacing"/>
+        <w:rPr>
+          <w:b/>
+          <w:bCs/>
+        </w:rPr>
+      </w:pPr>
+      <w:r>
+        <w:rPr>
+          <w:b/>
+          <w:bCs/>
+        </w:rPr>
+        <w:t>From PC0 (Allowed Host)</w:t>
+      </w:r>
+    </w:p>
+    <w:p>
+      <w:pPr>
+        <w:pStyle w:val="NoSpacing"/>
+      </w:pPr>
+      <w:r>
+        <w:t>ping 192.168.2.10</w:t>
+      </w:r>
+    </w:p>
+    <w:p>
+      <w:pPr>
+        <w:pStyle w:val="NoSpacing"/>
+      </w:pPr>
+      <w:r>
+        <w:rPr>
+          <w:b/>
+          <w:bCs/>
+        </w:rPr>
+        <w:t>Expected Result:</w:t>
+      </w:r>
+      <w:r>
+        <w:t xml:space="preserve"> Successful reply</w:t>
+      </w:r>
+    </w:p>
+    <w:p>
+      <w:pPr>
+        <w:pStyle w:val="NoSpacing"/>
+      </w:pPr>
+      <w:r>
+        <w:pict w14:anchorId="6118A9C9">
+          <v:rect id="_x0000_i1042" style="width:0;height:1.5pt" o:hralign="center" o:hrstd="t" o:hr="t" fillcolor="#a0a0a0" stroked="f"/>
+        </w:pict>
+      </w:r>
+    </w:p>
+    <w:p>
+      <w:pPr>
+        <w:pStyle w:val="NoSpacing"/>
+        <w:rPr>
+          <w:b/>
+          <w:bCs/>
+        </w:rPr>
+      </w:pPr>
+      <w:r>
+        <w:rPr>
+          <w:b/>
+          <w:bCs/>
+        </w:rPr>
+        <w:t>From PC1 (Blocked Host)</w:t>
+      </w:r>
+    </w:p>
+    <w:p>
+      <w:pPr>
+        <w:pStyle w:val="NoSpacing"/>
+      </w:pPr>
+      <w:r>
+        <w:t>ping 192.168.2.10</w:t>
+      </w:r>
+    </w:p>
+    <w:p>
+      <w:pPr>
+        <w:pStyle w:val="NoSpacing"/>
+      </w:pPr>
+      <w:r>
+        <w:rPr>
+          <w:b/>
+          <w:bCs/>
+        </w:rPr>
+        <w:t>Expected Result:</w:t>
+      </w:r>
+      <w:r>
+        <w:t xml:space="preserve"> Request timed out</w:t>
+      </w:r>
+    </w:p>
+    <w:p>
+      <w:pPr>
+        <w:pStyle w:val="NoSpacing"/>
+      </w:pPr>
+    </w:p>
+    <w:p>
+      <w:pPr>
+        <w:pStyle w:val="NoSpacing"/>
+      </w:pPr>
+    </w:p>
+    <w:p>
+      <w:pPr>
+        <w:pStyle w:val="NoSpacing"/>
+      </w:pPr>
+    </w:p>
+    <w:p>
+      <w:pPr>
+        <w:pStyle w:val="NoSpacing"/>
+        <w:rPr>
+          <w:b/>
+          <w:bCs/>
+        </w:rPr>
+      </w:pPr>
+      <w:r>
+        <w:rPr>
+          <w:b/>
+          <w:bCs/>
+        </w:rPr>
+        <w:t>13 ) C</w:t>
+      </w:r>
+      <w:r>
+        <w:rPr>
+          <w:b/>
+          <w:bCs/>
+        </w:rPr>
+        <w:t>onfiguring an Extended ACL to Block HTTP and FTP Traffic</w:t>
+      </w:r>
+    </w:p>
+    <w:p>
+      <w:pPr>
+        <w:pStyle w:val="NoSpacing"/>
+        <w:rPr>
+          <w:b/>
+          <w:bCs/>
+        </w:rPr>
+      </w:pPr>
+    </w:p>
+    <w:p>
+      <w:pPr>
+        <w:pStyle w:val="NoSpacing"/>
+        <w:rPr>
+          <w:b/>
+          <w:bCs/>
+        </w:rPr>
+      </w:pPr>
+      <w:r>
+        <w:rPr>
+          <w:b/>
+          <w:bCs/>
+        </w:rPr>
+        <w:t>What is an Extended ACL?</w:t>
+      </w:r>
+    </w:p>
+    <w:p>
+      <w:pPr>
+        <w:pStyle w:val="NoSpacing"/>
+      </w:pPr>
+      <w:r>
+        <w:t>An Extended ACL filters traffic based on </w:t>
+      </w:r>
+      <w:r>
+        <w:rPr>
+          <w:b/>
+          <w:bCs/>
+        </w:rPr>
+        <w:t>source IP, destination IP, protocol, and port number</w:t>
+      </w:r>
+      <w:r>
+        <w:t>. This makes it more flexible than a Standard ACL. Extended ACLs are numbered from </w:t>
+      </w:r>
+      <w:r>
+        <w:rPr>
+          <w:b/>
+          <w:bCs/>
+        </w:rPr>
+        <w:t>100 to 199</w:t>
+      </w:r>
+      <w:r>
+        <w:t> and should be placed close to the </w:t>
+      </w:r>
+      <w:r>
+        <w:rPr>
+          <w:b/>
+          <w:bCs/>
+        </w:rPr>
+        <w:t>source</w:t>
+      </w:r>
+      <w:r>
+        <w:t> to stop unwanted traffic early. Like Standard ACLs, they also have an implicit deny at the end.</w:t>
+      </w:r>
+    </w:p>
+    <w:p>
+      <w:pPr>
+        <w:pStyle w:val="NoSpacing"/>
+      </w:pPr>
+    </w:p>
+    <w:p>
+      <w:pPr>
+        <w:pStyle w:val="NoSpacing"/>
+        <w:rPr>
+          <w:b/>
+          <w:bCs/>
+        </w:rPr>
+      </w:pPr>
+    </w:p>
+    <w:p>
+      <w:pPr>
+        <w:pStyle w:val="NoSpacing"/>
+        <w:rPr>
+          <w:b/>
+          <w:bCs/>
+        </w:rPr>
+      </w:pPr>
+      <w:r>
+        <w:rPr>
+          <w:b/>
+          <w:bCs/>
+        </w:rPr>
+        <w:lastRenderedPageBreak/>
+        <w:t>Network Setup</w:t>
+      </w:r>
+    </w:p>
+    <w:tbl>
+      <w:tblPr>
+        <w:tblW w:w="0" w:type="auto"/>
+        <w:tblCellMar>
+          <w:top w:w="15" w:type="dxa"/>
+          <w:left w:w="15" w:type="dxa"/>
+          <w:bottom w:w="15" w:type="dxa"/>
+          <w:right w:w="15" w:type="dxa"/>
+        </w:tblCellMar>
+        <w:tblLook w:val="04A0" w:firstRow="1" w:lastRow="0" w:firstColumn="1" w:lastColumn="0" w:noHBand="0" w:noVBand="1"/>
+      </w:tblPr>
+      <w:tblGrid>
+        <w:gridCol w:w="1141"/>
+        <w:gridCol w:w="3032"/>
+        <w:gridCol w:w="1732"/>
+      </w:tblGrid>
+      <w:tr>
+        <w:trPr>
+          <w:tblHeader/>
+        </w:trPr>
+        <w:tc>
+          <w:tcPr>
+            <w:tcW w:w="0" w:type="auto"/>
+            <w:tcBorders>
+              <w:top w:val="single" w:sz="8" w:space="0" w:color="D1D9E0"/>
+              <w:left w:val="single" w:sz="8" w:space="0" w:color="D1D9E0"/>
+              <w:bottom w:val="single" w:sz="8" w:space="0" w:color="D1D9E0"/>
+              <w:right w:val="single" w:sz="8" w:space="0" w:color="D1D9E0"/>
+            </w:tcBorders>
+            <w:shd w:val="clear" w:color="auto" w:fill="FFFFFF"/>
+            <w:tcMar>
+              <w:top w:w="90" w:type="dxa"/>
+              <w:left w:w="195" w:type="dxa"/>
+              <w:bottom w:w="90" w:type="dxa"/>
+              <w:right w:w="195" w:type="dxa"/>
+            </w:tcMar>
+            <w:vAlign w:val="center"/>
+            <w:hideMark/>
+          </w:tcPr>
+          <w:p>
+            <w:pPr>
+              <w:pStyle w:val="NoSpacing"/>
+              <w:rPr>
+                <w:b/>
+                <w:bCs/>
+              </w:rPr>
+            </w:pPr>
+            <w:r>
+              <w:rPr>
+                <w:b/>
+                <w:bCs/>
+              </w:rPr>
+              <w:t>Device</w:t>
+            </w:r>
+          </w:p>
+        </w:tc>
+        <w:tc>
+          <w:tcPr>
+            <w:tcW w:w="0" w:type="auto"/>
+            <w:tcBorders>
+              <w:top w:val="single" w:sz="8" w:space="0" w:color="D1D9E0"/>
+              <w:left w:val="single" w:sz="8" w:space="0" w:color="D1D9E0"/>
+              <w:bottom w:val="single" w:sz="8" w:space="0" w:color="D1D9E0"/>
+              <w:right w:val="single" w:sz="8" w:space="0" w:color="D1D9E0"/>
+            </w:tcBorders>
+            <w:shd w:val="clear" w:color="auto" w:fill="FFFFFF"/>
+            <w:tcMar>
+              <w:top w:w="90" w:type="dxa"/>
+              <w:left w:w="195" w:type="dxa"/>
+              <w:bottom w:w="90" w:type="dxa"/>
+              <w:right w:w="195" w:type="dxa"/>
+            </w:tcMar>
+            <w:vAlign w:val="center"/>
+            <w:hideMark/>
+          </w:tcPr>
+          <w:p>
+            <w:pPr>
+              <w:pStyle w:val="NoSpacing"/>
+              <w:rPr>
+                <w:b/>
+                <w:bCs/>
+              </w:rPr>
+            </w:pPr>
+            <w:r>
+              <w:rPr>
+                <w:b/>
+                <w:bCs/>
+              </w:rPr>
+              <w:t>IP Address</w:t>
+            </w:r>
+          </w:p>
+        </w:tc>
+        <w:tc>
+          <w:tcPr>
+            <w:tcW w:w="0" w:type="auto"/>
+            <w:tcBorders>
+              <w:top w:val="single" w:sz="8" w:space="0" w:color="D1D9E0"/>
+              <w:left w:val="single" w:sz="8" w:space="0" w:color="D1D9E0"/>
+              <w:bottom w:val="single" w:sz="8" w:space="0" w:color="D1D9E0"/>
+              <w:right w:val="single" w:sz="8" w:space="0" w:color="D1D9E0"/>
+            </w:tcBorders>
+            <w:shd w:val="clear" w:color="auto" w:fill="FFFFFF"/>
+            <w:tcMar>
+              <w:top w:w="90" w:type="dxa"/>
+              <w:left w:w="195" w:type="dxa"/>
+              <w:bottom w:w="90" w:type="dxa"/>
+              <w:right w:w="195" w:type="dxa"/>
+            </w:tcMar>
+            <w:vAlign w:val="center"/>
+            <w:hideMark/>
+          </w:tcPr>
+          <w:p>
+            <w:pPr>
+              <w:pStyle w:val="NoSpacing"/>
+              <w:rPr>
+                <w:b/>
+                <w:bCs/>
+              </w:rPr>
+            </w:pPr>
+            <w:r>
+              <w:rPr>
+                <w:b/>
+                <w:bCs/>
+              </w:rPr>
+              <w:t>Role</w:t>
+            </w:r>
+          </w:p>
+        </w:tc>
+      </w:tr>
+      <w:tr>
+        <w:tc>
+          <w:tcPr>
+            <w:tcW w:w="0" w:type="auto"/>
+            <w:tcBorders>
+              <w:top w:val="single" w:sz="8" w:space="0" w:color="D1D9E0"/>
+              <w:left w:val="single" w:sz="8" w:space="0" w:color="D1D9E0"/>
+              <w:bottom w:val="single" w:sz="8" w:space="0" w:color="D1D9E0"/>
+              <w:right w:val="single" w:sz="8" w:space="0" w:color="D1D9E0"/>
+            </w:tcBorders>
+            <w:shd w:val="clear" w:color="auto" w:fill="FFFFFF"/>
+            <w:tcMar>
+              <w:top w:w="90" w:type="dxa"/>
+              <w:left w:w="195" w:type="dxa"/>
+              <w:bottom w:w="90" w:type="dxa"/>
+              <w:right w:w="195" w:type="dxa"/>
+            </w:tcMar>
+            <w:vAlign w:val="center"/>
+            <w:hideMark/>
+          </w:tcPr>
+          <w:p>
+            <w:pPr>
+              <w:pStyle w:val="NoSpacing"/>
+            </w:pPr>
+            <w:r>
+              <w:t>Router</w:t>
+            </w:r>
+          </w:p>
+        </w:tc>
+        <w:tc>
+          <w:tcPr>
+            <w:tcW w:w="0" w:type="auto"/>
+            <w:tcBorders>
+              <w:top w:val="single" w:sz="8" w:space="0" w:color="D1D9E0"/>
+              <w:left w:val="single" w:sz="8" w:space="0" w:color="D1D9E0"/>
+              <w:bottom w:val="single" w:sz="8" w:space="0" w:color="D1D9E0"/>
+              <w:right w:val="single" w:sz="8" w:space="0" w:color="D1D9E0"/>
+            </w:tcBorders>
+            <w:shd w:val="clear" w:color="auto" w:fill="FFFFFF"/>
+            <w:tcMar>
+              <w:top w:w="90" w:type="dxa"/>
+              <w:left w:w="195" w:type="dxa"/>
+              <w:bottom w:w="90" w:type="dxa"/>
+              <w:right w:w="195" w:type="dxa"/>
+            </w:tcMar>
+            <w:vAlign w:val="center"/>
+            <w:hideMark/>
+          </w:tcPr>
+          <w:p>
+            <w:pPr>
+              <w:pStyle w:val="NoSpacing"/>
+            </w:pPr>
+            <w:r>
+              <w:t>192.168.1.1 / 192.168.2.1</w:t>
+            </w:r>
+          </w:p>
+        </w:tc>
+        <w:tc>
+          <w:tcPr>
+            <w:tcW w:w="0" w:type="auto"/>
+            <w:tcBorders>
+              <w:top w:val="single" w:sz="8" w:space="0" w:color="D1D9E0"/>
+              <w:left w:val="single" w:sz="8" w:space="0" w:color="D1D9E0"/>
+              <w:bottom w:val="single" w:sz="8" w:space="0" w:color="D1D9E0"/>
+              <w:right w:val="single" w:sz="8" w:space="0" w:color="D1D9E0"/>
+            </w:tcBorders>
+            <w:shd w:val="clear" w:color="auto" w:fill="FFFFFF"/>
+            <w:tcMar>
+              <w:top w:w="90" w:type="dxa"/>
+              <w:left w:w="195" w:type="dxa"/>
+              <w:bottom w:w="90" w:type="dxa"/>
+              <w:right w:w="195" w:type="dxa"/>
+            </w:tcMar>
+            <w:vAlign w:val="center"/>
+            <w:hideMark/>
+          </w:tcPr>
+          <w:p>
+            <w:pPr>
+              <w:pStyle w:val="NoSpacing"/>
+            </w:pPr>
+            <w:r>
+              <w:t>Gateway</w:t>
+            </w:r>
+          </w:p>
+        </w:tc>
+      </w:tr>
+      <w:tr>
+        <w:tc>
+          <w:tcPr>
+            <w:tcW w:w="0" w:type="auto"/>
+            <w:tcBorders>
+              <w:top w:val="single" w:sz="8" w:space="0" w:color="D1D9E0"/>
+              <w:left w:val="single" w:sz="8" w:space="0" w:color="D1D9E0"/>
+              <w:bottom w:val="single" w:sz="8" w:space="0" w:color="D1D9E0"/>
+              <w:right w:val="single" w:sz="8" w:space="0" w:color="D1D9E0"/>
+            </w:tcBorders>
+            <w:shd w:val="clear" w:color="auto" w:fill="F6F8FA"/>
+            <w:tcMar>
+              <w:top w:w="90" w:type="dxa"/>
+              <w:left w:w="195" w:type="dxa"/>
+              <w:bottom w:w="90" w:type="dxa"/>
+              <w:right w:w="195" w:type="dxa"/>
+            </w:tcMar>
+            <w:vAlign w:val="center"/>
+            <w:hideMark/>
+          </w:tcPr>
+          <w:p>
+            <w:pPr>
+              <w:pStyle w:val="NoSpacing"/>
+            </w:pPr>
+            <w:r>
+              <w:t>PC0</w:t>
+            </w:r>
+          </w:p>
+        </w:tc>
+        <w:tc>
+          <w:tcPr>
+            <w:tcW w:w="0" w:type="auto"/>
+            <w:tcBorders>
+              <w:top w:val="single" w:sz="8" w:space="0" w:color="D1D9E0"/>
+              <w:left w:val="single" w:sz="8" w:space="0" w:color="D1D9E0"/>
+              <w:bottom w:val="single" w:sz="8" w:space="0" w:color="D1D9E0"/>
+              <w:right w:val="single" w:sz="8" w:space="0" w:color="D1D9E0"/>
+            </w:tcBorders>
+            <w:shd w:val="clear" w:color="auto" w:fill="F6F8FA"/>
+            <w:tcMar>
+              <w:top w:w="90" w:type="dxa"/>
+              <w:left w:w="195" w:type="dxa"/>
+              <w:bottom w:w="90" w:type="dxa"/>
+              <w:right w:w="195" w:type="dxa"/>
+            </w:tcMar>
+            <w:vAlign w:val="center"/>
+            <w:hideMark/>
+          </w:tcPr>
+          <w:p>
+            <w:pPr>
+              <w:pStyle w:val="NoSpacing"/>
+            </w:pPr>
+            <w:r>
+              <w:t>192.168.1.10</w:t>
+            </w:r>
+          </w:p>
+        </w:tc>
+        <w:tc>
+          <w:tcPr>
+            <w:tcW w:w="0" w:type="auto"/>
+            <w:tcBorders>
+              <w:top w:val="single" w:sz="8" w:space="0" w:color="D1D9E0"/>
+              <w:left w:val="single" w:sz="8" w:space="0" w:color="D1D9E0"/>
+              <w:bottom w:val="single" w:sz="8" w:space="0" w:color="D1D9E0"/>
+              <w:right w:val="single" w:sz="8" w:space="0" w:color="D1D9E0"/>
+            </w:tcBorders>
+            <w:shd w:val="clear" w:color="auto" w:fill="F6F8FA"/>
+            <w:tcMar>
+              <w:top w:w="90" w:type="dxa"/>
+              <w:left w:w="195" w:type="dxa"/>
+              <w:bottom w:w="90" w:type="dxa"/>
+              <w:right w:w="195" w:type="dxa"/>
+            </w:tcMar>
+            <w:vAlign w:val="center"/>
+            <w:hideMark/>
+          </w:tcPr>
+          <w:p>
+            <w:pPr>
+              <w:pStyle w:val="NoSpacing"/>
+            </w:pPr>
+            <w:r>
+              <w:t>Blocked host</w:t>
+            </w:r>
+          </w:p>
+        </w:tc>
+      </w:tr>
+      <w:tr>
+        <w:tc>
+          <w:tcPr>
+            <w:tcW w:w="0" w:type="auto"/>
+            <w:tcBorders>
+              <w:top w:val="single" w:sz="8" w:space="0" w:color="D1D9E0"/>
+              <w:left w:val="single" w:sz="8" w:space="0" w:color="D1D9E0"/>
+              <w:bottom w:val="single" w:sz="8" w:space="0" w:color="D1D9E0"/>
+              <w:right w:val="single" w:sz="8" w:space="0" w:color="D1D9E0"/>
+            </w:tcBorders>
+            <w:shd w:val="clear" w:color="auto" w:fill="FFFFFF"/>
+            <w:tcMar>
+              <w:top w:w="90" w:type="dxa"/>
+              <w:left w:w="195" w:type="dxa"/>
+              <w:bottom w:w="90" w:type="dxa"/>
+              <w:right w:w="195" w:type="dxa"/>
+            </w:tcMar>
+            <w:vAlign w:val="center"/>
+            <w:hideMark/>
+          </w:tcPr>
+          <w:p>
+            <w:pPr>
+              <w:pStyle w:val="NoSpacing"/>
+            </w:pPr>
+            <w:r>
+              <w:t>PC1</w:t>
+            </w:r>
+          </w:p>
+        </w:tc>
+        <w:tc>
+          <w:tcPr>
+            <w:tcW w:w="0" w:type="auto"/>
+            <w:tcBorders>
+              <w:top w:val="single" w:sz="8" w:space="0" w:color="D1D9E0"/>
+              <w:left w:val="single" w:sz="8" w:space="0" w:color="D1D9E0"/>
+              <w:bottom w:val="single" w:sz="8" w:space="0" w:color="D1D9E0"/>
+              <w:right w:val="single" w:sz="8" w:space="0" w:color="D1D9E0"/>
+            </w:tcBorders>
+            <w:shd w:val="clear" w:color="auto" w:fill="FFFFFF"/>
+            <w:tcMar>
+              <w:top w:w="90" w:type="dxa"/>
+              <w:left w:w="195" w:type="dxa"/>
+              <w:bottom w:w="90" w:type="dxa"/>
+              <w:right w:w="195" w:type="dxa"/>
+            </w:tcMar>
+            <w:vAlign w:val="center"/>
+            <w:hideMark/>
+          </w:tcPr>
+          <w:p>
+            <w:pPr>
+              <w:pStyle w:val="NoSpacing"/>
+            </w:pPr>
+            <w:r>
+              <w:t>192.168.1.20</w:t>
+            </w:r>
+          </w:p>
+        </w:tc>
+        <w:tc>
+          <w:tcPr>
+            <w:tcW w:w="0" w:type="auto"/>
+            <w:tcBorders>
+              <w:top w:val="single" w:sz="8" w:space="0" w:color="D1D9E0"/>
+              <w:left w:val="single" w:sz="8" w:space="0" w:color="D1D9E0"/>
+              <w:bottom w:val="single" w:sz="8" w:space="0" w:color="D1D9E0"/>
+              <w:right w:val="single" w:sz="8" w:space="0" w:color="D1D9E0"/>
+            </w:tcBorders>
+            <w:shd w:val="clear" w:color="auto" w:fill="FFFFFF"/>
+            <w:tcMar>
+              <w:top w:w="90" w:type="dxa"/>
+              <w:left w:w="195" w:type="dxa"/>
+              <w:bottom w:w="90" w:type="dxa"/>
+              <w:right w:w="195" w:type="dxa"/>
+            </w:tcMar>
+            <w:vAlign w:val="center"/>
+            <w:hideMark/>
+          </w:tcPr>
+          <w:p>
+            <w:pPr>
+              <w:pStyle w:val="NoSpacing"/>
+            </w:pPr>
+            <w:r>
+              <w:t>Allowed host</w:t>
+            </w:r>
+          </w:p>
+        </w:tc>
+      </w:tr>
+      <w:tr>
+        <w:tc>
+          <w:tcPr>
+            <w:tcW w:w="0" w:type="auto"/>
+            <w:tcBorders>
+              <w:top w:val="single" w:sz="8" w:space="0" w:color="D1D9E0"/>
+              <w:left w:val="single" w:sz="8" w:space="0" w:color="D1D9E0"/>
+              <w:bottom w:val="single" w:sz="8" w:space="0" w:color="D1D9E0"/>
+              <w:right w:val="single" w:sz="8" w:space="0" w:color="D1D9E0"/>
+            </w:tcBorders>
+            <w:shd w:val="clear" w:color="auto" w:fill="F6F8FA"/>
+            <w:tcMar>
+              <w:top w:w="90" w:type="dxa"/>
+              <w:left w:w="195" w:type="dxa"/>
+              <w:bottom w:w="90" w:type="dxa"/>
+              <w:right w:w="195" w:type="dxa"/>
+            </w:tcMar>
+            <w:vAlign w:val="center"/>
+            <w:hideMark/>
+          </w:tcPr>
+          <w:p>
+            <w:pPr>
+              <w:pStyle w:val="NoSpacing"/>
+            </w:pPr>
+            <w:r>
+              <w:t>Server</w:t>
+            </w:r>
+          </w:p>
+        </w:tc>
+        <w:tc>
+          <w:tcPr>
+            <w:tcW w:w="0" w:type="auto"/>
+            <w:tcBorders>
+              <w:top w:val="single" w:sz="8" w:space="0" w:color="D1D9E0"/>
+              <w:left w:val="single" w:sz="8" w:space="0" w:color="D1D9E0"/>
+              <w:bottom w:val="single" w:sz="8" w:space="0" w:color="D1D9E0"/>
+              <w:right w:val="single" w:sz="8" w:space="0" w:color="D1D9E0"/>
+            </w:tcBorders>
+            <w:shd w:val="clear" w:color="auto" w:fill="F6F8FA"/>
+            <w:tcMar>
+              <w:top w:w="90" w:type="dxa"/>
+              <w:left w:w="195" w:type="dxa"/>
+              <w:bottom w:w="90" w:type="dxa"/>
+              <w:right w:w="195" w:type="dxa"/>
+            </w:tcMar>
+            <w:vAlign w:val="center"/>
+            <w:hideMark/>
+          </w:tcPr>
+          <w:p>
+            <w:pPr>
+              <w:pStyle w:val="NoSpacing"/>
+            </w:pPr>
+            <w:r>
+              <w:t>192.168.2.10</w:t>
+            </w:r>
+          </w:p>
+        </w:tc>
+        <w:tc>
+          <w:tcPr>
+            <w:tcW w:w="0" w:type="auto"/>
+            <w:tcBorders>
+              <w:top w:val="single" w:sz="8" w:space="0" w:color="D1D9E0"/>
+              <w:left w:val="single" w:sz="8" w:space="0" w:color="D1D9E0"/>
+              <w:bottom w:val="single" w:sz="8" w:space="0" w:color="D1D9E0"/>
+              <w:right w:val="single" w:sz="8" w:space="0" w:color="D1D9E0"/>
+            </w:tcBorders>
+            <w:shd w:val="clear" w:color="auto" w:fill="F6F8FA"/>
+            <w:tcMar>
+              <w:top w:w="90" w:type="dxa"/>
+              <w:left w:w="195" w:type="dxa"/>
+              <w:bottom w:w="90" w:type="dxa"/>
+              <w:right w:w="195" w:type="dxa"/>
+            </w:tcMar>
+            <w:vAlign w:val="center"/>
+            <w:hideMark/>
+          </w:tcPr>
+          <w:p>
+            <w:pPr>
+              <w:pStyle w:val="NoSpacing"/>
+            </w:pPr>
+            <w:r>
+              <w:t>Destination</w:t>
+            </w:r>
+          </w:p>
+        </w:tc>
+      </w:tr>
+    </w:tbl>
+    <w:p>
+      <w:pPr>
+        <w:pStyle w:val="NoSpacing"/>
+      </w:pPr>
+      <w:r>
+        <w:rPr>
+          <w:b/>
+          <w:bCs/>
+        </w:rPr>
+        <w:t>Goal:</w:t>
+      </w:r>
+      <w:r>
+        <w:t> Block HTTP (port 80) and FTP (port 21) from PC0 to the server, allow everything else.</w:t>
+      </w:r>
+    </w:p>
+    <w:p>
+      <w:pPr>
+        <w:pStyle w:val="NoSpacing"/>
+      </w:pPr>
+      <w:r>
+        <w:pict w14:anchorId="0000A1B0">
+          <v:rect id="_x0000_i1087" style="width:0;height:3pt" o:hralign="center" o:hrstd="t" o:hr="t" fillcolor="#a0a0a0" stroked="f"/>
+        </w:pict>
+      </w:r>
+    </w:p>
+    <w:p>
+      <w:pPr>
+        <w:pStyle w:val="NoSpacing"/>
+        <w:rPr>
+          <w:b/>
+          <w:bCs/>
+        </w:rPr>
+      </w:pPr>
+    </w:p>
+    <w:p>
+      <w:r>
+        <w:t>1. Configure Router Interfaces</w:t>
+      </w:r>
+    </w:p>
+    <w:p>
+      <w:pPr>
+        <w:pStyle w:val="NoSpacing"/>
+      </w:pPr>
+      <w:r>
+        <w:t>enable</w:t>
+      </w:r>
+    </w:p>
+    <w:p>
+      <w:pPr>
+        <w:pStyle w:val="NoSpacing"/>
+      </w:pPr>
+      <w:r>
+        <w:t>configure terminal</w:t>
+      </w:r>
+    </w:p>
+    <w:p>
+      <w:pPr>
+        <w:pStyle w:val="NoSpacing"/>
+      </w:pPr>
+    </w:p>
+    <w:p>
+      <w:pPr>
+        <w:pStyle w:val="NoSpacing"/>
+      </w:pPr>
+      <w:r>
+        <w:t xml:space="preserve">interface </w:t>
+      </w:r>
+      <w:proofErr w:type="spellStart"/>
+      <w:r>
+        <w:t>fastethernet</w:t>
+      </w:r>
+      <w:proofErr w:type="spellEnd"/>
+      <w:r>
+        <w:t xml:space="preserve"> 0/0</w:t>
+      </w:r>
+    </w:p>
+    <w:p>
+      <w:pPr>
+        <w:pStyle w:val="NoSpacing"/>
+      </w:pPr>
+      <w:proofErr w:type="spellStart"/>
+      <w:r>
+        <w:t>ip</w:t>
+      </w:r>
+      <w:proofErr w:type="spellEnd"/>
+      <w:r>
+        <w:t xml:space="preserve"> address 192.168.1.1 255.255.255.0</w:t>
+      </w:r>
+    </w:p>
+    <w:p>
+      <w:pPr>
+        <w:pStyle w:val="NoSpacing"/>
+      </w:pPr>
+      <w:r>
+        <w:t>no shutdown</w:t>
+      </w:r>
+    </w:p>
+    <w:p>
+      <w:pPr>
+        <w:pStyle w:val="NoSpacing"/>
+      </w:pPr>
+      <w:r>
+        <w:t>exit</w:t>
+      </w:r>
+    </w:p>
+    <w:p>
+      <w:pPr>
+        <w:pStyle w:val="NoSpacing"/>
+      </w:pPr>
+    </w:p>
+    <w:p>
+      <w:pPr>
+        <w:pStyle w:val="NoSpacing"/>
+      </w:pPr>
+      <w:r>
+        <w:t xml:space="preserve">interface </w:t>
+      </w:r>
+      <w:proofErr w:type="spellStart"/>
+      <w:r>
+        <w:t>fastethernet</w:t>
+      </w:r>
+      <w:proofErr w:type="spellEnd"/>
+      <w:r>
+        <w:t xml:space="preserve"> 0/1</w:t>
+      </w:r>
+    </w:p>
+    <w:p>
+      <w:pPr>
+        <w:pStyle w:val="NoSpacing"/>
+      </w:pPr>
+      <w:proofErr w:type="spellStart"/>
+      <w:r>
+        <w:t>ip</w:t>
+      </w:r>
+      <w:proofErr w:type="spellEnd"/>
+      <w:r>
+        <w:t xml:space="preserve"> address 192.168.2.1 255.255.255.0</w:t>
+      </w:r>
+    </w:p>
+    <w:p>
+      <w:pPr>
+        <w:pStyle w:val="NoSpacing"/>
+      </w:pPr>
+      <w:r>
+        <w:t>no shutdown</w:t>
+      </w:r>
+    </w:p>
+    <w:p>
+      <w:pPr>
+        <w:pStyle w:val="NoSpacing"/>
+      </w:pPr>
+      <w:r>
+        <w:t>exit</w:t>
+      </w:r>
+    </w:p>
+    <w:p>
+      <w:pPr>
+        <w:pStyle w:val="NoSpacing"/>
+      </w:pPr>
+    </w:p>
+    <w:p>
+      <w:pPr>
+        <w:pStyle w:val="NoSpacing"/>
+      </w:pPr>
+      <w:r>
+        <w:t>2. Create Extended ACL</w:t>
+      </w:r>
+    </w:p>
+    <w:p>
+      <w:pPr>
+        <w:pStyle w:val="NoSpacing"/>
+      </w:pPr>
+    </w:p>
+    <w:p>
+      <w:pPr>
+        <w:pStyle w:val="NoSpacing"/>
+      </w:pPr>
+      <w:r>
+        <w:t xml:space="preserve">access-list 110 deny </w:t>
+      </w:r>
+      <w:proofErr w:type="spellStart"/>
+      <w:r>
+        <w:t>tcp</w:t>
+      </w:r>
+      <w:proofErr w:type="spellEnd"/>
+      <w:r>
+        <w:t xml:space="preserve"> host 192.168.1.10 host 192.168.2.10 </w:t>
+      </w:r>
+      <w:proofErr w:type="spellStart"/>
+      <w:r>
+        <w:t>eq</w:t>
+      </w:r>
+      <w:proofErr w:type="spellEnd"/>
+      <w:r>
+        <w:t xml:space="preserve"> 80</w:t>
+      </w:r>
+    </w:p>
+    <w:p>
+      <w:pPr>
+        <w:pStyle w:val="NoSpacing"/>
+      </w:pPr>
+      <w:r>
+        <w:t xml:space="preserve">access-list 110 deny </w:t>
+      </w:r>
+      <w:proofErr w:type="spellStart"/>
+      <w:r>
+        <w:t>tcp</w:t>
+      </w:r>
+      <w:proofErr w:type="spellEnd"/>
+      <w:r>
+        <w:t xml:space="preserve"> host 192.168.1.10 host 192.168.2.10 </w:t>
+      </w:r>
+      <w:proofErr w:type="spellStart"/>
+      <w:r>
+        <w:t>eq</w:t>
+      </w:r>
+      <w:proofErr w:type="spellEnd"/>
+      <w:r>
+        <w:t xml:space="preserve"> 21</w:t>
+      </w:r>
+    </w:p>
+    <w:p>
+      <w:pPr>
+        <w:pStyle w:val="NoSpacing"/>
+      </w:pPr>
+      <w:r>
+        <w:t xml:space="preserve">access-list 110 permit </w:t>
+      </w:r>
+      <w:proofErr w:type="spellStart"/>
+      <w:r>
+        <w:t>ip</w:t>
+      </w:r>
+      <w:proofErr w:type="spellEnd"/>
+      <w:r>
+        <w:t xml:space="preserve"> any </w:t>
+      </w:r>
+      <w:proofErr w:type="spellStart"/>
+      <w:r>
+        <w:t>any</w:t>
+      </w:r>
+      <w:proofErr w:type="spellEnd"/>
+    </w:p>
+    <w:p>
+      <w:pPr>
+        <w:pStyle w:val="NoSpacing"/>
+      </w:pPr>
+    </w:p>
+    <w:p>
+      <w:pPr>
+        <w:pStyle w:val="NoSpacing"/>
+      </w:pPr>
+      <w:r>
+        <w:t>3. Apply ACL</w:t>
+      </w:r>
+    </w:p>
+    <w:p>
+      <w:pPr>
+        <w:pStyle w:val="NoSpacing"/>
+      </w:pPr>
+    </w:p>
+    <w:p>
+      <w:pPr>
+        <w:pStyle w:val="NoSpacing"/>
+      </w:pPr>
+      <w:r>
+        <w:t xml:space="preserve">interface </w:t>
+      </w:r>
+      <w:proofErr w:type="spellStart"/>
+      <w:r>
+        <w:t>fastethernet</w:t>
+      </w:r>
+      <w:proofErr w:type="spellEnd"/>
+      <w:r>
+        <w:t xml:space="preserve"> 0/0</w:t>
+      </w:r>
+    </w:p>
+    <w:p>
+      <w:pPr>
+        <w:pStyle w:val="NoSpacing"/>
+      </w:pPr>
+      <w:proofErr w:type="spellStart"/>
+      <w:r>
+        <w:t>ip</w:t>
+      </w:r>
+      <w:proofErr w:type="spellEnd"/>
+      <w:r>
+        <w:t xml:space="preserve"> access-group 110 in</w:t>
+      </w:r>
+    </w:p>
+    <w:p>
+      <w:pPr>
+        <w:pStyle w:val="NoSpacing"/>
+      </w:pPr>
+    </w:p>
+    <w:p>
+      <w:pPr>
+        <w:pStyle w:val="NoSpacing"/>
+      </w:pPr>
+    </w:p>
+    <w:p>
+      <w:pPr>
+        <w:pStyle w:val="NoSpacing"/>
+      </w:pPr>
+      <w:r>
+        <w:t xml:space="preserve">14 ) </w:t>
+      </w:r>
+      <w:r>
+        <w:t>NAT (Network Address Translation) in Cisco Routers</w:t>
+      </w:r>
+    </w:p>
+    <w:p>
+      <w:pPr>
+        <w:pStyle w:val="NoSpacing"/>
+      </w:pPr>
+    </w:p>
+    <w:p>
+      <w:pPr>
+        <w:pStyle w:val="NoSpacing"/>
+      </w:pPr>
+      <w:r>
+        <w:t>NAT is used to translate private IP addresses to public IP addresses so devices on a private network can communicate with external networks (like the Internet).</w:t>
+      </w:r>
+    </w:p>
+    <w:p>
+      <w:pPr>
+        <w:pStyle w:val="NoSpacing"/>
+      </w:pPr>
+    </w:p>
+    <w:p>
+      <w:pPr>
+        <w:pStyle w:val="NoSpacing"/>
+      </w:pPr>
+      <w:r>
+        <w:t>There are three main types of NAT:</w:t>
+      </w:r>
+    </w:p>
+    <w:p>
+      <w:pPr>
+        <w:pStyle w:val="NoSpacing"/>
+      </w:pPr>
+    </w:p>
+    <w:p>
+      <w:pPr>
+        <w:pStyle w:val="NoSpacing"/>
+      </w:pPr>
+      <w:r>
+        <w:lastRenderedPageBreak/>
+        <w:t>1. Static NAT</w:t>
+      </w:r>
+    </w:p>
+    <w:p>
+      <w:pPr>
+        <w:pStyle w:val="NoSpacing"/>
+      </w:pPr>
+    </w:p>
+    <w:p>
+      <w:pPr>
+        <w:pStyle w:val="NoSpacing"/>
+      </w:pPr>
+      <w:r>
+        <w:t>Definition:</w:t>
+      </w:r>
+    </w:p>
+    <w:p>
+      <w:pPr>
+        <w:pStyle w:val="NoSpacing"/>
+      </w:pPr>
+    </w:p>
+    <w:p>
+      <w:pPr>
+        <w:pStyle w:val="NoSpacing"/>
+      </w:pPr>
+      <w:r>
+        <w:t>One-to-one mapping between a private IP and a public IP.</w:t>
+      </w:r>
+    </w:p>
+    <w:p>
+      <w:pPr>
+        <w:pStyle w:val="NoSpacing"/>
+      </w:pPr>
+      <w:r>
+        <w:t>Always translates the same private IP to the same public IP.</w:t>
+      </w:r>
+    </w:p>
+    <w:p>
+      <w:pPr>
+        <w:pStyle w:val="NoSpacing"/>
+      </w:pPr>
+      <w:r>
+        <w:t>Used when you need a device to always be reachable from the Internet (e.g., a web server).</w:t>
+      </w:r>
+    </w:p>
+    <w:p>
+      <w:pPr>
+        <w:pStyle w:val="NoSpacing"/>
+      </w:pPr>
+    </w:p>
+    <w:p>
+      <w:pPr>
+        <w:pStyle w:val="NoSpacing"/>
+      </w:pPr>
+      <w:r>
+        <w:t>Example:</w:t>
+      </w:r>
+    </w:p>
+    <w:p>
+      <w:pPr>
+        <w:pStyle w:val="NoSpacing"/>
+      </w:pPr>
+    </w:p>
+    <w:p>
+      <w:pPr>
+        <w:pStyle w:val="NoSpacing"/>
+      </w:pPr>
+      <w:r>
+        <w:t>Private IP: 192.168.1.10</w:t>
+      </w:r>
+    </w:p>
+    <w:p>
+      <w:pPr>
+        <w:pStyle w:val="NoSpacing"/>
+      </w:pPr>
+      <w:r>
+        <w:t>Public IP: 200.1.1.10</w:t>
+      </w:r>
+    </w:p>
+    <w:p>
+      <w:pPr>
+        <w:pStyle w:val="NoSpacing"/>
+      </w:pPr>
+    </w:p>
+    <w:p>
+      <w:pPr>
+        <w:pStyle w:val="NoSpacing"/>
+      </w:pPr>
+      <w:r>
+        <w:t>Steps to Configure Static NAT:</w:t>
+      </w:r>
+    </w:p>
+    <w:p>
+      <w:pPr>
+        <w:pStyle w:val="NoSpacing"/>
+      </w:pPr>
+    </w:p>
+    <w:p>
+      <w:pPr>
+        <w:pStyle w:val="NoSpacing"/>
+      </w:pPr>
+      <w:r>
+        <w:t>Enter global configuration:</w:t>
+      </w:r>
+    </w:p>
+    <w:p>
+      <w:pPr>
+        <w:pStyle w:val="NoSpacing"/>
+      </w:pPr>
+      <w:r>
+        <w:t>Router&gt; enable</w:t>
+      </w:r>
+    </w:p>
+    <w:p>
+      <w:pPr>
+        <w:pStyle w:val="NoSpacing"/>
+      </w:pPr>
+      <w:r>
+        <w:t>Router# configure terminal</w:t>
+      </w:r>
+    </w:p>
+    <w:p>
+      <w:pPr>
+        <w:pStyle w:val="NoSpacing"/>
+      </w:pPr>
+      <w:r>
+        <w:t>Configure the inside and outside interfaces:</w:t>
+      </w:r>
+    </w:p>
+    <w:p>
+      <w:pPr>
+        <w:pStyle w:val="NoSpacing"/>
+      </w:pPr>
+      <w:r>
+        <w:t>Router(config)# interface gigabitEthernet0/0</w:t>
+      </w:r>
+    </w:p>
+    <w:p>
+      <w:pPr>
+        <w:pStyle w:val="NoSpacing"/>
+      </w:pPr>
+      <w:r>
+        <w:t xml:space="preserve">Router(config-if)# </w:t>
+      </w:r>
+      <w:proofErr w:type="spellStart"/>
+      <w:r>
+        <w:t>ip</w:t>
+      </w:r>
+      <w:proofErr w:type="spellEnd"/>
+      <w:r>
+        <w:t xml:space="preserve"> address 192.168.1.1 255.255.255.0</w:t>
+      </w:r>
+    </w:p>
+    <w:p>
+      <w:pPr>
+        <w:pStyle w:val="NoSpacing"/>
+      </w:pPr>
+      <w:r>
+        <w:t xml:space="preserve">Router(config-if)# </w:t>
+      </w:r>
+      <w:proofErr w:type="spellStart"/>
+      <w:r>
+        <w:t>ip</w:t>
+      </w:r>
+      <w:proofErr w:type="spellEnd"/>
+      <w:r>
+        <w:t xml:space="preserve"> </w:t>
+      </w:r>
+      <w:proofErr w:type="spellStart"/>
+      <w:r>
+        <w:t>nat</w:t>
+      </w:r>
+      <w:proofErr w:type="spellEnd"/>
+      <w:r>
+        <w:t xml:space="preserve"> inside</w:t>
+      </w:r>
+    </w:p>
+    <w:p>
+      <w:pPr>
+        <w:pStyle w:val="NoSpacing"/>
+      </w:pPr>
+      <w:r>
+        <w:t>Router(config-if)# no shutdown</w:t>
+      </w:r>
+    </w:p>
+    <w:p>
+      <w:pPr>
+        <w:pStyle w:val="NoSpacing"/>
+      </w:pPr>
+      <w:r>
+        <w:t>Router(config-if)# exit</w:t>
+      </w:r>
+    </w:p>
+    <w:p>
+      <w:pPr>
+        <w:pStyle w:val="NoSpacing"/>
+      </w:pPr>
+    </w:p>
+    <w:p>
+      <w:pPr>
+        <w:pStyle w:val="NoSpacing"/>
+      </w:pPr>
+      <w:r>
+        <w:t>Router(config)# interface gigabitEthernet0/1</w:t>
+      </w:r>
+    </w:p>
+    <w:p>
+      <w:pPr>
+        <w:pStyle w:val="NoSpacing"/>
+      </w:pPr>
+      <w:r>
+        <w:t xml:space="preserve">Router(config-if)# </w:t>
+      </w:r>
+      <w:proofErr w:type="spellStart"/>
+      <w:r>
+        <w:t>ip</w:t>
+      </w:r>
+      <w:proofErr w:type="spellEnd"/>
+      <w:r>
+        <w:t xml:space="preserve"> address 200.1.1.1 255.255.255.0</w:t>
+      </w:r>
+    </w:p>
+    <w:p>
+      <w:pPr>
+        <w:pStyle w:val="NoSpacing"/>
+      </w:pPr>
+      <w:r>
+        <w:t xml:space="preserve">Router(config-if)# </w:t>
+      </w:r>
+      <w:proofErr w:type="spellStart"/>
+      <w:r>
+        <w:t>ip</w:t>
+      </w:r>
+      <w:proofErr w:type="spellEnd"/>
+      <w:r>
+        <w:t xml:space="preserve"> </w:t>
+      </w:r>
+      <w:proofErr w:type="spellStart"/>
+      <w:r>
+        <w:t>nat</w:t>
+      </w:r>
+      <w:proofErr w:type="spellEnd"/>
+      <w:r>
+        <w:t xml:space="preserve"> outside</w:t>
+      </w:r>
+    </w:p>
+    <w:p>
+      <w:pPr>
+        <w:pStyle w:val="NoSpacing"/>
+      </w:pPr>
+      <w:r>
+        <w:t>Router(config-if)# exit</w:t>
+      </w:r>
+    </w:p>
+    <w:p>
+      <w:pPr>
+        <w:pStyle w:val="NoSpacing"/>
+      </w:pPr>
+      <w:r>
+        <w:t>Configure Static NAT translation:</w:t>
+      </w:r>
+    </w:p>
+    <w:p>
+      <w:pPr>
+        <w:pStyle w:val="NoSpacing"/>
+      </w:pPr>
+      <w:r>
+        <w:t xml:space="preserve">Router(config)# </w:t>
+      </w:r>
+      <w:proofErr w:type="spellStart"/>
+      <w:r>
+        <w:t>ip</w:t>
+      </w:r>
+      <w:proofErr w:type="spellEnd"/>
+      <w:r>
+        <w:t xml:space="preserve"> </w:t>
+      </w:r>
+      <w:proofErr w:type="spellStart"/>
+      <w:r>
+        <w:t>nat</w:t>
+      </w:r>
+      <w:proofErr w:type="spellEnd"/>
+      <w:r>
+        <w:t xml:space="preserve"> inside source static 192.168.1.10 200.1.1.10</w:t>
+      </w:r>
+    </w:p>
+    <w:p>
+      <w:pPr>
+        <w:pStyle w:val="NoSpacing"/>
+      </w:pPr>
+      <w:r>
+        <w:t>Test:</w:t>
+      </w:r>
+    </w:p>
+    <w:p>
+      <w:pPr>
+        <w:pStyle w:val="NoSpacing"/>
+      </w:pPr>
+      <w:r>
+        <w:t>From an external device with public IP range → ping or access 200.1.1.10 → traffic is forwarded to 192.168.1.10</w:t>
+      </w:r>
+    </w:p>
+    <w:p>
+      <w:pPr>
+        <w:pStyle w:val="NoSpacing"/>
+      </w:pPr>
+      <w:r>
+        <w:t>2. Dynamic NAT</w:t>
+      </w:r>
+    </w:p>
+    <w:p>
+      <w:pPr>
+        <w:pStyle w:val="NoSpacing"/>
+      </w:pPr>
+    </w:p>
+    <w:p>
+      <w:pPr>
+        <w:pStyle w:val="NoSpacing"/>
+      </w:pPr>
+      <w:r>
+        <w:t>Definition:</w:t>
+      </w:r>
+    </w:p>
+    <w:p>
+      <w:pPr>
+        <w:pStyle w:val="NoSpacing"/>
+      </w:pPr>
+    </w:p>
+    <w:p>
+      <w:pPr>
+        <w:pStyle w:val="NoSpacing"/>
+      </w:pPr>
+      <w:r>
+        <w:t>Maps private IPs to a pool of public IPs dynamically.</w:t>
+      </w:r>
+    </w:p>
+    <w:p>
+      <w:pPr>
+        <w:pStyle w:val="NoSpacing"/>
+      </w:pPr>
+      <w:r>
+        <w:t>One private IP is mapped to one available public IP from the pool when needed.</w:t>
+      </w:r>
+    </w:p>
+    <w:p>
+      <w:pPr>
+        <w:pStyle w:val="NoSpacing"/>
+      </w:pPr>
+      <w:r>
+        <w:t>Used when you have limited public IPs and multiple devices.</w:t>
+      </w:r>
+    </w:p>
+    <w:p>
+      <w:pPr>
+        <w:pStyle w:val="NoSpacing"/>
+      </w:pPr>
+    </w:p>
+    <w:p>
+      <w:pPr>
+        <w:pStyle w:val="NoSpacing"/>
+      </w:pPr>
+      <w:r>
+        <w:t>Example:</w:t>
+      </w:r>
+    </w:p>
+    <w:p>
+      <w:pPr>
+        <w:pStyle w:val="NoSpacing"/>
+      </w:pPr>
+    </w:p>
+    <w:p>
+      <w:pPr>
+        <w:pStyle w:val="NoSpacing"/>
+      </w:pPr>
+      <w:r>
+        <w:t>Private network: 192.168.1.0/24</w:t>
+      </w:r>
+    </w:p>
+    <w:p>
+      <w:pPr>
+        <w:pStyle w:val="NoSpacing"/>
+      </w:pPr>
+      <w:r>
+        <w:t>Public IP pool: 200.1.1.10 – 200.1.1.20</w:t>
+      </w:r>
+    </w:p>
+    <w:p>
+      <w:pPr>
+        <w:pStyle w:val="NoSpacing"/>
+      </w:pPr>
+    </w:p>
+    <w:p>
+      <w:pPr>
+        <w:pStyle w:val="NoSpacing"/>
+      </w:pPr>
+      <w:r>
+        <w:t>Steps to Configure Dynamic NAT:</w:t>
+      </w:r>
+    </w:p>
+    <w:p>
+      <w:pPr>
+        <w:pStyle w:val="NoSpacing"/>
+      </w:pPr>
+    </w:p>
+    <w:p>
+      <w:pPr>
+        <w:pStyle w:val="NoSpacing"/>
+      </w:pPr>
+      <w:r>
+        <w:t>Define the public IP pool:</w:t>
+      </w:r>
+    </w:p>
+    <w:p>
+      <w:pPr>
+        <w:pStyle w:val="NoSpacing"/>
+      </w:pPr>
+      <w:r>
+        <w:t xml:space="preserve">Router(config)# </w:t>
+      </w:r>
+      <w:proofErr w:type="spellStart"/>
+      <w:r>
+        <w:t>ip</w:t>
+      </w:r>
+      <w:proofErr w:type="spellEnd"/>
+      <w:r>
+        <w:t xml:space="preserve"> </w:t>
+      </w:r>
+      <w:proofErr w:type="spellStart"/>
+      <w:r>
+        <w:t>nat</w:t>
+      </w:r>
+      <w:proofErr w:type="spellEnd"/>
+      <w:r>
+        <w:t xml:space="preserve"> pool MYPOOL 200.1.1.10 200.1.1.20 netmask 255.255.255.0</w:t>
+      </w:r>
+    </w:p>
+    <w:p>
+      <w:pPr>
+        <w:pStyle w:val="NoSpacing"/>
+      </w:pPr>
+      <w:r>
+        <w:t>Define the access list for private IPs to be translated:</w:t>
+      </w:r>
+    </w:p>
+    <w:p>
+      <w:pPr>
+        <w:pStyle w:val="NoSpacing"/>
+      </w:pPr>
+      <w:r>
+        <w:t>Router(config)# access-list 1 permit 192.168.1.0 0.0.0.255</w:t>
+      </w:r>
+    </w:p>
+    <w:p>
+      <w:pPr>
+        <w:pStyle w:val="NoSpacing"/>
+      </w:pPr>
+      <w:r>
+        <w:t>Apply Dynamic NAT:</w:t>
+      </w:r>
+    </w:p>
+    <w:p>
+      <w:pPr>
+        <w:pStyle w:val="NoSpacing"/>
+      </w:pPr>
+      <w:r>
+        <w:t xml:space="preserve">Router(config)# </w:t>
+      </w:r>
+      <w:proofErr w:type="spellStart"/>
+      <w:r>
+        <w:t>ip</w:t>
+      </w:r>
+      <w:proofErr w:type="spellEnd"/>
+      <w:r>
+        <w:t xml:space="preserve"> </w:t>
+      </w:r>
+      <w:proofErr w:type="spellStart"/>
+      <w:r>
+        <w:t>nat</w:t>
+      </w:r>
+      <w:proofErr w:type="spellEnd"/>
+      <w:r>
+        <w:t xml:space="preserve"> inside source list 1 pool MYPOOL</w:t>
+      </w:r>
+    </w:p>
+    <w:p>
+      <w:pPr>
+        <w:pStyle w:val="NoSpacing"/>
+      </w:pPr>
+      <w:r>
+        <w:t>Test:</w:t>
+      </w:r>
+    </w:p>
+    <w:p>
+      <w:pPr>
+        <w:pStyle w:val="NoSpacing"/>
+      </w:pPr>
+      <w:r>
+        <w:t>When PC1 (192.168.1.10) sends traffic to the Internet → router assigns an available public IP from the pool (200.1.1.10–20).</w:t>
+      </w:r>
+    </w:p>
+    <w:p>
+      <w:pPr>
+        <w:pStyle w:val="NoSpacing"/>
+      </w:pPr>
+      <w:r>
+        <w:t>If another PC communicates → gets another free IP from the pool.</w:t>
+      </w:r>
+    </w:p>
+    <w:p>
+      <w:pPr>
+        <w:pStyle w:val="NoSpacing"/>
+      </w:pPr>
+      <w:r>
+        <w:t>3. PAT (Port Address Translation / NAT Overload)</w:t>
+      </w:r>
+    </w:p>
+    <w:p>
+      <w:pPr>
+        <w:pStyle w:val="NoSpacing"/>
+      </w:pPr>
+    </w:p>
+    <w:p>
+      <w:pPr>
+        <w:pStyle w:val="NoSpacing"/>
+      </w:pPr>
+      <w:r>
+        <w:t>Definition:</w:t>
+      </w:r>
+    </w:p>
+    <w:p>
+      <w:pPr>
+        <w:pStyle w:val="NoSpacing"/>
+      </w:pPr>
+    </w:p>
+    <w:p>
+      <w:pPr>
+        <w:pStyle w:val="NoSpacing"/>
+      </w:pPr>
+      <w:r>
+        <w:t>Maps many private IPs to a single public IP using different port numbers.</w:t>
+      </w:r>
+    </w:p>
+    <w:p>
+      <w:pPr>
+        <w:pStyle w:val="NoSpacing"/>
+      </w:pPr>
+      <w:r>
+        <w:t>Also called NAT Overload.</w:t>
+      </w:r>
+    </w:p>
+    <w:p>
+      <w:pPr>
+        <w:pStyle w:val="NoSpacing"/>
+      </w:pPr>
+      <w:r>
+        <w:t>Efficient for networks with many devices but limited public IPs.</w:t>
+      </w:r>
+    </w:p>
+    <w:p>
+      <w:pPr>
+        <w:pStyle w:val="NoSpacing"/>
+      </w:pPr>
+    </w:p>
+    <w:p>
+      <w:pPr>
+        <w:pStyle w:val="NoSpacing"/>
+      </w:pPr>
+      <w:r>
+        <w:t>Example:</w:t>
+      </w:r>
+    </w:p>
+    <w:p>
+      <w:pPr>
+        <w:pStyle w:val="NoSpacing"/>
+      </w:pPr>
+    </w:p>
+    <w:p>
+      <w:pPr>
+        <w:pStyle w:val="NoSpacing"/>
+      </w:pPr>
+      <w:r>
+        <w:t>Private network: 192.168.1.0/24</w:t>
+      </w:r>
+    </w:p>
+    <w:p>
+      <w:pPr>
+        <w:pStyle w:val="NoSpacing"/>
+      </w:pPr>
+      <w:r>
+        <w:t>Single public IP: 200.1.1.10</w:t>
+      </w:r>
+    </w:p>
+    <w:p>
+      <w:pPr>
+        <w:pStyle w:val="NoSpacing"/>
+      </w:pPr>
+    </w:p>
+    <w:p>
+      <w:pPr>
+        <w:pStyle w:val="NoSpacing"/>
+      </w:pPr>
+      <w:r>
+        <w:t>Steps to Configure PAT:</w:t>
+      </w:r>
+    </w:p>
+    <w:p>
+      <w:pPr>
+        <w:pStyle w:val="NoSpacing"/>
+      </w:pPr>
+    </w:p>
+    <w:p>
+      <w:pPr>
+        <w:pStyle w:val="NoSpacing"/>
+      </w:pPr>
+      <w:r>
+        <w:t>Configure inside and outside interfaces (same as static/dynamic NAT):</w:t>
+      </w:r>
+    </w:p>
+    <w:p>
+      <w:pPr>
+        <w:pStyle w:val="NoSpacing"/>
+      </w:pPr>
+      <w:r>
+        <w:t>Router(config)# interface g0/0</w:t>
+      </w:r>
+    </w:p>
+    <w:p>
+      <w:pPr>
+        <w:pStyle w:val="NoSpacing"/>
+      </w:pPr>
+      <w:r>
+        <w:t xml:space="preserve">Router(config-if)# </w:t>
+      </w:r>
+      <w:proofErr w:type="spellStart"/>
+      <w:r>
+        <w:t>ip</w:t>
+      </w:r>
+      <w:proofErr w:type="spellEnd"/>
+      <w:r>
+        <w:t xml:space="preserve"> </w:t>
+      </w:r>
+      <w:proofErr w:type="spellStart"/>
+      <w:r>
+        <w:t>nat</w:t>
+      </w:r>
+      <w:proofErr w:type="spellEnd"/>
+      <w:r>
+        <w:t xml:space="preserve"> inside</w:t>
+      </w:r>
+    </w:p>
+    <w:p>
+      <w:pPr>
+        <w:pStyle w:val="NoSpacing"/>
+      </w:pPr>
+      <w:r>
+        <w:t>Router(config-if)# exit</w:t>
+      </w:r>
+    </w:p>
+    <w:p>
+      <w:pPr>
+        <w:pStyle w:val="NoSpacing"/>
+      </w:pPr>
+      <w:r>
+        <w:t>Router(config)# interface g0/1</w:t>
+      </w:r>
+    </w:p>
+    <w:p>
+      <w:pPr>
+        <w:pStyle w:val="NoSpacing"/>
+      </w:pPr>
+      <w:r>
+        <w:t xml:space="preserve">Router(config-if)# </w:t>
+      </w:r>
+      <w:proofErr w:type="spellStart"/>
+      <w:r>
+        <w:t>ip</w:t>
+      </w:r>
+      <w:proofErr w:type="spellEnd"/>
+      <w:r>
+        <w:t xml:space="preserve"> </w:t>
+      </w:r>
+      <w:proofErr w:type="spellStart"/>
+      <w:r>
+        <w:t>nat</w:t>
+      </w:r>
+      <w:proofErr w:type="spellEnd"/>
+      <w:r>
+        <w:t xml:space="preserve"> outside</w:t>
+      </w:r>
+    </w:p>
+    <w:p>
+      <w:pPr>
+        <w:pStyle w:val="NoSpacing"/>
+      </w:pPr>
+      <w:r>
+        <w:t>Router(config-if)# exit</w:t>
+      </w:r>
+    </w:p>
+    <w:p>
+      <w:pPr>
+        <w:pStyle w:val="NoSpacing"/>
+      </w:pPr>
+      <w:r>
+        <w:t>Define access list for private IPs:</w:t>
+      </w:r>
+    </w:p>
+    <w:p>
+      <w:pPr>
+        <w:pStyle w:val="NoSpacing"/>
+      </w:pPr>
+      <w:r>
+        <w:t>Router(config)# access-list 1 permit 192.168.1.0 0.0.0.255</w:t>
+      </w:r>
+    </w:p>
+    <w:p>
+      <w:pPr>
+        <w:pStyle w:val="NoSpacing"/>
+      </w:pPr>
+      <w:r>
+        <w:t>Configure PAT:</w:t>
+      </w:r>
+    </w:p>
+    <w:p>
+      <w:pPr>
+        <w:pStyle w:val="NoSpacing"/>
+      </w:pPr>
+      <w:r>
+        <w:t xml:space="preserve">Router(config)# </w:t>
+      </w:r>
+      <w:proofErr w:type="spellStart"/>
+      <w:r>
+        <w:t>ip</w:t>
+      </w:r>
+      <w:proofErr w:type="spellEnd"/>
+      <w:r>
+        <w:t xml:space="preserve"> </w:t>
+      </w:r>
+      <w:proofErr w:type="spellStart"/>
+      <w:r>
+        <w:t>nat</w:t>
+      </w:r>
+      <w:proofErr w:type="spellEnd"/>
+      <w:r>
+        <w:t xml:space="preserve"> inside source list 1 interface g0/1 overload</w:t>
+      </w:r>
+    </w:p>
+    <w:p>
+      <w:pPr>
+        <w:pStyle w:val="NoSpacing"/>
+      </w:pPr>
+      <w:r>
+        <w:t>Test:</w:t>
+      </w:r>
+    </w:p>
+    <w:p>
+      <w:pPr>
+        <w:pStyle w:val="NoSpacing"/>
+      </w:pPr>
+      <w:r>
+        <w:t>Multiple PCs in 192.168.1.0/24 → all share single public IP (200.1.1.10)</w:t>
+      </w:r>
+    </w:p>
+    <w:p>
+      <w:pPr>
+        <w:pStyle w:val="NoSpacing"/>
+      </w:pPr>
+      <w:r>
+        <w:t>Router differentiates traffic using port numbers.</w:t>
+      </w:r>
+    </w:p>
     <w:sectPr>
       <w:pgSz w:w="11906" w:h="16838"/>
       <w:pgMar w:top="1440" w:right="1440" w:bottom="1440" w:left="1440" w:header="708" w:footer="708" w:gutter="0"/>
@@ -3494,6 +6065,15 @@
       <w:spacing w:val="5"/>
     </w:rPr>
   </w:style>
+  <w:style w:type="paragraph" w:styleId="NoSpacing">
+    <w:name w:val="No Spacing"/>
+    <w:uiPriority w:val="1"/>
+    <w:qFormat/>
+    <w:rsid w:val="008A62A9"/>
+    <w:pPr>
+      <w:spacing w:after="0" w:line="240" w:lineRule="auto"/>
+    </w:pPr>
+  </w:style>
 </w:styles>
 </file>
 

</xml_diff>